<commit_message>
Show vendor payment 1500000000 in the Contract-to-Payment use case
The refreshed journal extract clears invoices 5100001598 and 5100001599 with document type KZ for 160.50 USD on 20261006.

Co-authored-by: aleo25672 <aleo25672@users.noreply.github.com>
</commit_message>
<xml_diff>
--- a/docs/CONTRACT_TO_PAYMENT.docx
+++ b/docs/CONTRACT_TO_PAYMENT.docx
@@ -44,6 +44,8 @@
         <w:t>Reference documents: purchase contract 4600000041 and purchase order 4500002146</w:t>
         <w:br/>
         <w:t>SAP S/4HANA DEX extracts · ZEVO_CDS_EXPLORER_2_FILE · run 20261006_094549</w:t>
+        <w:br/>
+        <w:t>Journal refreshed from I_GLAccountLineItemRawData bounded 20261006_104841</w:t>
         <w:br/>
         <w:t>Company code 1710 · purchasing organization 1710 · USD</w:t>
       </w:r>
@@ -690,7 +692,7 @@
                 <w:color w:val="1A1A1A"/>
                 <w:sz w:val="16"/>
               </w:rPr>
-              <w:t>Payment</w:t>
+              <w:t>Payment 1500000000 (type KZ)</w:t>
             </w:r>
           </w:p>
         </w:tc>
@@ -717,7 +719,7 @@
                 <w:color w:val="1A1A1A"/>
                 <w:sz w:val="16"/>
               </w:rPr>
-              <w:t>Not in this extract. Vendor account 21100000 remains open for 160.50 USD</w:t>
+              <w:t>160.50 USD on 20261006. Clears both invoice vendor lines. Vendor balance 0.00</w:t>
             </w:r>
           </w:p>
         </w:tc>
@@ -761,7 +763,7 @@
           <w:color w:val="1A1A1A"/>
           <w:sz w:val="22"/>
         </w:rPr>
-        <w:t>4600000041 is the only purchase contract that is present in the bounded contract header and item extracts and that also has a release order in the purchase-order extract. PO 4500002146 is that release, and it continues through goods receipt, supplier invoice, and the universal journal.</w:t>
+        <w:t>4600000041 is the only purchase contract that is present in the bounded contract header and item extracts and that also has a release order in the purchase-order extract. PO 4500002146 is that release, and it continues through goods receipt, supplier invoice, the universal journal, and vendor payment 1500000000.</w:t>
       </w:r>
     </w:p>
     <w:p>
@@ -12519,7 +12521,7 @@
                 <w:color w:val="1A1A1A"/>
                 <w:sz w:val="16"/>
               </w:rPr>
-              <w:t>0013600000</w:t>
+              <w:t>0011002000</w:t>
             </w:r>
           </w:p>
         </w:tc>
@@ -12546,7 +12548,7 @@
                 <w:color w:val="1A1A1A"/>
                 <w:sz w:val="16"/>
               </w:rPr>
-              <w:t>13600000</w:t>
+              <w:t>11002000</w:t>
             </w:r>
           </w:p>
         </w:tc>
@@ -12625,7 +12627,7 @@
                 <w:color w:val="1A1A1A"/>
                 <w:sz w:val="16"/>
               </w:rPr>
-              <w:t>Stock, debited at goods receipt (financial account type M)</w:t>
+              <w:t>Credited by the vendor payment (document type KZ)</w:t>
             </w:r>
           </w:p>
         </w:tc>
@@ -12657,7 +12659,7 @@
                 <w:color w:val="1A1A1A"/>
                 <w:sz w:val="16"/>
               </w:rPr>
-              <w:t>0021120000</w:t>
+              <w:t>0013600000</w:t>
             </w:r>
           </w:p>
         </w:tc>
@@ -12684,7 +12686,7 @@
                 <w:color w:val="1A1A1A"/>
                 <w:sz w:val="16"/>
               </w:rPr>
-              <w:t>21120000</w:t>
+              <w:t>13600000</w:t>
             </w:r>
           </w:p>
         </w:tc>
@@ -12737,7 +12739,6 @@
                 <w:color w:val="1A1A1A"/>
                 <w:sz w:val="16"/>
               </w:rPr>
-              <w:t>X</w:t>
             </w:r>
           </w:p>
         </w:tc>
@@ -12764,7 +12765,7 @@
                 <w:color w:val="1A1A1A"/>
                 <w:sz w:val="16"/>
               </w:rPr>
-              <w:t>GR/IR (financial account type S)</w:t>
+              <w:t>Stock, debited at goods receipt (financial account type M)</w:t>
             </w:r>
           </w:p>
         </w:tc>
@@ -12796,7 +12797,7 @@
                 <w:color w:val="1A1A1A"/>
                 <w:sz w:val="16"/>
               </w:rPr>
-              <w:t>0021100000</w:t>
+              <w:t>0021120000</w:t>
             </w:r>
           </w:p>
         </w:tc>
@@ -12823,7 +12824,7 @@
                 <w:color w:val="1A1A1A"/>
                 <w:sz w:val="16"/>
               </w:rPr>
-              <w:t>21100000</w:t>
+              <w:t>21120000</w:t>
             </w:r>
           </w:p>
         </w:tc>
@@ -12850,7 +12851,6 @@
                 <w:color w:val="1A1A1A"/>
                 <w:sz w:val="16"/>
               </w:rPr>
-              <w:t>K</w:t>
             </w:r>
           </w:p>
         </w:tc>
@@ -12877,6 +12877,7 @@
                 <w:color w:val="1A1A1A"/>
                 <w:sz w:val="16"/>
               </w:rPr>
+              <w:t>X</w:t>
             </w:r>
           </w:p>
         </w:tc>
@@ -12884,6 +12885,145 @@
           <w:tcPr>
             <w:tcW w:type="dxa" w:w="2085"/>
             <w:shd w:val="clear" w:color="auto" w:fill="FFFFFF"/>
+            <w:tcMar>
+              <w:top w:w="60" w:type="dxa"/>
+              <w:left w:w="60" w:type="dxa"/>
+              <w:bottom w:w="60" w:type="dxa"/>
+              <w:right w:w="60" w:type="dxa"/>
+            </w:tcMar>
+          </w:tcPr>
+          <w:p>
+            <w:pPr>
+              <w:spacing w:before="20" w:after="20"/>
+            </w:pPr>
+            <w:r/>
+            <w:r>
+              <w:rPr>
+                <w:rFonts w:ascii="Calibri" w:hAnsi="Calibri" w:eastAsia="Calibri"/>
+                <w:b w:val="0"/>
+                <w:color w:val="1A1A1A"/>
+                <w:sz w:val="16"/>
+              </w:rPr>
+              <w:t>GR/IR (financial account type S)</w:t>
+            </w:r>
+          </w:p>
+        </w:tc>
+      </w:tr>
+      <w:tr>
+        <w:trPr>
+          <w:cantSplit/>
+        </w:trPr>
+        <w:tc>
+          <w:tcPr>
+            <w:tcW w:type="dxa" w:w="2085"/>
+            <w:shd w:val="clear" w:color="auto" w:fill="F3F6F9"/>
+            <w:tcMar>
+              <w:top w:w="60" w:type="dxa"/>
+              <w:left w:w="60" w:type="dxa"/>
+              <w:bottom w:w="60" w:type="dxa"/>
+              <w:right w:w="60" w:type="dxa"/>
+            </w:tcMar>
+          </w:tcPr>
+          <w:p>
+            <w:pPr>
+              <w:spacing w:before="20" w:after="20"/>
+            </w:pPr>
+            <w:r/>
+            <w:r>
+              <w:rPr>
+                <w:rFonts w:ascii="Calibri" w:hAnsi="Calibri" w:eastAsia="Calibri"/>
+                <w:b w:val="0"/>
+                <w:color w:val="1A1A1A"/>
+                <w:sz w:val="16"/>
+              </w:rPr>
+              <w:t>0021100000</w:t>
+            </w:r>
+          </w:p>
+        </w:tc>
+        <w:tc>
+          <w:tcPr>
+            <w:tcW w:type="dxa" w:w="2085"/>
+            <w:shd w:val="clear" w:color="auto" w:fill="F3F6F9"/>
+            <w:tcMar>
+              <w:top w:w="60" w:type="dxa"/>
+              <w:left w:w="60" w:type="dxa"/>
+              <w:bottom w:w="60" w:type="dxa"/>
+              <w:right w:w="60" w:type="dxa"/>
+            </w:tcMar>
+          </w:tcPr>
+          <w:p>
+            <w:pPr>
+              <w:spacing w:before="20" w:after="20"/>
+            </w:pPr>
+            <w:r/>
+            <w:r>
+              <w:rPr>
+                <w:rFonts w:ascii="Calibri" w:hAnsi="Calibri" w:eastAsia="Calibri"/>
+                <w:b w:val="0"/>
+                <w:color w:val="1A1A1A"/>
+                <w:sz w:val="16"/>
+              </w:rPr>
+              <w:t>21100000</w:t>
+            </w:r>
+          </w:p>
+        </w:tc>
+        <w:tc>
+          <w:tcPr>
+            <w:tcW w:type="dxa" w:w="2085"/>
+            <w:shd w:val="clear" w:color="auto" w:fill="F3F6F9"/>
+            <w:tcMar>
+              <w:top w:w="60" w:type="dxa"/>
+              <w:left w:w="60" w:type="dxa"/>
+              <w:bottom w:w="60" w:type="dxa"/>
+              <w:right w:w="60" w:type="dxa"/>
+            </w:tcMar>
+          </w:tcPr>
+          <w:p>
+            <w:pPr>
+              <w:spacing w:before="20" w:after="20"/>
+            </w:pPr>
+            <w:r/>
+            <w:r>
+              <w:rPr>
+                <w:rFonts w:ascii="Calibri" w:hAnsi="Calibri" w:eastAsia="Calibri"/>
+                <w:b w:val="0"/>
+                <w:color w:val="1A1A1A"/>
+                <w:sz w:val="16"/>
+              </w:rPr>
+              <w:t>K</w:t>
+            </w:r>
+          </w:p>
+        </w:tc>
+        <w:tc>
+          <w:tcPr>
+            <w:tcW w:type="dxa" w:w="2085"/>
+            <w:shd w:val="clear" w:color="auto" w:fill="F3F6F9"/>
+            <w:tcMar>
+              <w:top w:w="60" w:type="dxa"/>
+              <w:left w:w="60" w:type="dxa"/>
+              <w:bottom w:w="60" w:type="dxa"/>
+              <w:right w:w="60" w:type="dxa"/>
+            </w:tcMar>
+          </w:tcPr>
+          <w:p>
+            <w:pPr>
+              <w:spacing w:before="20" w:after="20"/>
+            </w:pPr>
+            <w:r/>
+            <w:r>
+              <w:rPr>
+                <w:rFonts w:ascii="Calibri" w:hAnsi="Calibri" w:eastAsia="Calibri"/>
+                <w:b w:val="0"/>
+                <w:color w:val="1A1A1A"/>
+                <w:sz w:val="16"/>
+              </w:rPr>
+            </w:r>
+          </w:p>
+        </w:tc>
+        <w:tc>
+          <w:tcPr>
+            <w:tcW w:type="dxa" w:w="2085"/>
+            <w:shd w:val="clear" w:color="auto" w:fill="F3F6F9"/>
             <w:tcMar>
               <w:top w:w="60" w:type="dxa"/>
               <w:left w:w="60" w:type="dxa"/>
@@ -13153,7 +13293,7 @@
                 <w:color w:val="FFFFFF"/>
                 <w:sz w:val="14"/>
               </w:rPr>
-              <w:t>PO item</w:t>
+              <w:t>Ref. type</w:t>
             </w:r>
           </w:p>
         </w:tc>
@@ -13180,7 +13320,7 @@
                 <w:color w:val="FFFFFF"/>
                 <w:sz w:val="14"/>
               </w:rPr>
-              <w:t>Ref. type</w:t>
+              <w:t>Reference document</w:t>
             </w:r>
           </w:p>
         </w:tc>
@@ -13207,7 +13347,7 @@
                 <w:color w:val="FFFFFF"/>
                 <w:sz w:val="14"/>
               </w:rPr>
-              <w:t>Reference document</w:t>
+              <w:t>Clearing doc</w:t>
             </w:r>
           </w:p>
         </w:tc>
@@ -13234,7 +13374,7 @@
                 <w:color w:val="FFFFFF"/>
                 <w:sz w:val="14"/>
               </w:rPr>
-              <w:t>Assignment</w:t>
+              <w:t>Clearing date</w:t>
             </w:r>
           </w:p>
         </w:tc>
@@ -13293,7 +13433,7 @@
                 <w:color w:val="1A1A1A"/>
                 <w:sz w:val="14"/>
               </w:rPr>
-              <w:t>5000000001</w:t>
+              <w:t>1500000000</w:t>
             </w:r>
           </w:p>
         </w:tc>
@@ -13320,7 +13460,7 @@
                 <w:color w:val="1A1A1A"/>
                 <w:sz w:val="14"/>
               </w:rPr>
-              <w:t>WE</w:t>
+              <w:t>KZ</w:t>
             </w:r>
           </w:p>
         </w:tc>
@@ -13374,7 +13514,7 @@
                 <w:color w:val="1A1A1A"/>
                 <w:sz w:val="14"/>
               </w:rPr>
-              <w:t>0013600000</w:t>
+              <w:t>0011002000</w:t>
             </w:r>
           </w:p>
         </w:tc>
@@ -13401,7 +13541,7 @@
                 <w:color w:val="1A1A1A"/>
                 <w:sz w:val="14"/>
               </w:rPr>
-              <w:t>S</w:t>
+              <w:t>H</w:t>
             </w:r>
           </w:p>
         </w:tc>
@@ -13428,7 +13568,7 @@
                 <w:color w:val="1A1A1A"/>
                 <w:sz w:val="14"/>
               </w:rPr>
-              <w:t>36.00</w:t>
+              <w:t>-160.50</w:t>
             </w:r>
           </w:p>
         </w:tc>
@@ -13455,7 +13595,7 @@
                 <w:color w:val="1A1A1A"/>
                 <w:sz w:val="14"/>
               </w:rPr>
-              <w:t>00020</w:t>
+              <w:t>BKPF</w:t>
             </w:r>
           </w:p>
         </w:tc>
@@ -13482,7 +13622,7 @@
                 <w:color w:val="1A1A1A"/>
                 <w:sz w:val="14"/>
               </w:rPr>
-              <w:t>MKPF</w:t>
+              <w:t>1500000000</w:t>
             </w:r>
           </w:p>
         </w:tc>
@@ -13509,7 +13649,6 @@
                 <w:color w:val="1A1A1A"/>
                 <w:sz w:val="14"/>
               </w:rPr>
-              <w:t>5000002931</w:t>
             </w:r>
           </w:p>
         </w:tc>
@@ -13593,7 +13732,7 @@
                 <w:color w:val="1A1A1A"/>
                 <w:sz w:val="14"/>
               </w:rPr>
-              <w:t>5000000001</w:t>
+              <w:t>1500000000</w:t>
             </w:r>
           </w:p>
         </w:tc>
@@ -13620,7 +13759,7 @@
                 <w:color w:val="1A1A1A"/>
                 <w:sz w:val="14"/>
               </w:rPr>
-              <w:t>WE</w:t>
+              <w:t>KZ</w:t>
             </w:r>
           </w:p>
         </w:tc>
@@ -13674,7 +13813,7 @@
                 <w:color w:val="1A1A1A"/>
                 <w:sz w:val="14"/>
               </w:rPr>
-              <w:t>0021120000</w:t>
+              <w:t>0021100000</w:t>
             </w:r>
           </w:p>
         </w:tc>
@@ -13701,7 +13840,7 @@
                 <w:color w:val="1A1A1A"/>
                 <w:sz w:val="14"/>
               </w:rPr>
-              <w:t>H</w:t>
+              <w:t>S</w:t>
             </w:r>
           </w:p>
         </w:tc>
@@ -13728,7 +13867,7 @@
                 <w:color w:val="1A1A1A"/>
                 <w:sz w:val="14"/>
               </w:rPr>
-              <w:t>-36.00</w:t>
+              <w:t>160.50</w:t>
             </w:r>
           </w:p>
         </w:tc>
@@ -13755,7 +13894,7 @@
                 <w:color w:val="1A1A1A"/>
                 <w:sz w:val="14"/>
               </w:rPr>
-              <w:t>00020</w:t>
+              <w:t>BKPF</w:t>
             </w:r>
           </w:p>
         </w:tc>
@@ -13782,7 +13921,7 @@
                 <w:color w:val="1A1A1A"/>
                 <w:sz w:val="14"/>
               </w:rPr>
-              <w:t>MKPF</w:t>
+              <w:t>1500000000</w:t>
             </w:r>
           </w:p>
         </w:tc>
@@ -13809,7 +13948,7 @@
                 <w:color w:val="1A1A1A"/>
                 <w:sz w:val="14"/>
               </w:rPr>
-              <w:t>5000002931</w:t>
+              <w:t>1500000000</w:t>
             </w:r>
           </w:p>
         </w:tc>
@@ -13836,7 +13975,7 @@
                 <w:color w:val="1A1A1A"/>
                 <w:sz w:val="14"/>
               </w:rPr>
-              <w:t>450000214600020</w:t>
+              <w:t>20261006</w:t>
             </w:r>
           </w:p>
         </w:tc>
@@ -13894,7 +14033,7 @@
                 <w:color w:val="1A1A1A"/>
                 <w:sz w:val="14"/>
               </w:rPr>
-              <w:t>5000000002</w:t>
+              <w:t>5000000001</w:t>
             </w:r>
           </w:p>
         </w:tc>
@@ -14029,7 +14168,7 @@
                 <w:color w:val="1A1A1A"/>
                 <w:sz w:val="14"/>
               </w:rPr>
-              <w:t>84.00</w:t>
+              <w:t>36.00</w:t>
             </w:r>
           </w:p>
         </w:tc>
@@ -14056,7 +14195,7 @@
                 <w:color w:val="1A1A1A"/>
                 <w:sz w:val="14"/>
               </w:rPr>
-              <w:t>00020</w:t>
+              <w:t>MKPF</w:t>
             </w:r>
           </w:p>
         </w:tc>
@@ -14083,7 +14222,7 @@
                 <w:color w:val="1A1A1A"/>
                 <w:sz w:val="14"/>
               </w:rPr>
-              <w:t>MKPF</w:t>
+              <w:t>5000002931</w:t>
             </w:r>
           </w:p>
         </w:tc>
@@ -14110,7 +14249,6 @@
                 <w:color w:val="1A1A1A"/>
                 <w:sz w:val="14"/>
               </w:rPr>
-              <w:t>5000002940</w:t>
             </w:r>
           </w:p>
         </w:tc>
@@ -14194,7 +14332,7 @@
                 <w:color w:val="1A1A1A"/>
                 <w:sz w:val="14"/>
               </w:rPr>
-              <w:t>5000000002</w:t>
+              <w:t>5000000001</w:t>
             </w:r>
           </w:p>
         </w:tc>
@@ -14329,7 +14467,7 @@
                 <w:color w:val="1A1A1A"/>
                 <w:sz w:val="14"/>
               </w:rPr>
-              <w:t>-84.00</w:t>
+              <w:t>-36.00</w:t>
             </w:r>
           </w:p>
         </w:tc>
@@ -14356,7 +14494,7 @@
                 <w:color w:val="1A1A1A"/>
                 <w:sz w:val="14"/>
               </w:rPr>
-              <w:t>00020</w:t>
+              <w:t>MKPF</w:t>
             </w:r>
           </w:p>
         </w:tc>
@@ -14383,7 +14521,7 @@
                 <w:color w:val="1A1A1A"/>
                 <w:sz w:val="14"/>
               </w:rPr>
-              <w:t>MKPF</w:t>
+              <w:t>5000002931</w:t>
             </w:r>
           </w:p>
         </w:tc>
@@ -14410,7 +14548,6 @@
                 <w:color w:val="1A1A1A"/>
                 <w:sz w:val="14"/>
               </w:rPr>
-              <w:t>5000002940</w:t>
             </w:r>
           </w:p>
         </w:tc>
@@ -14437,7 +14574,6 @@
                 <w:color w:val="1A1A1A"/>
                 <w:sz w:val="14"/>
               </w:rPr>
-              <w:t>450000214600020</w:t>
             </w:r>
           </w:p>
         </w:tc>
@@ -14495,7 +14631,7 @@
                 <w:color w:val="1A1A1A"/>
                 <w:sz w:val="14"/>
               </w:rPr>
-              <w:t>5000000003</w:t>
+              <w:t>5000000002</w:t>
             </w:r>
           </w:p>
         </w:tc>
@@ -14630,7 +14766,7 @@
                 <w:color w:val="1A1A1A"/>
                 <w:sz w:val="14"/>
               </w:rPr>
-              <w:t>40.50</w:t>
+              <w:t>84.00</w:t>
             </w:r>
           </w:p>
         </w:tc>
@@ -14657,7 +14793,7 @@
                 <w:color w:val="1A1A1A"/>
                 <w:sz w:val="14"/>
               </w:rPr>
-              <w:t>00010</w:t>
+              <w:t>MKPF</w:t>
             </w:r>
           </w:p>
         </w:tc>
@@ -14684,7 +14820,7 @@
                 <w:color w:val="1A1A1A"/>
                 <w:sz w:val="14"/>
               </w:rPr>
-              <w:t>MKPF</w:t>
+              <w:t>5000002940</w:t>
             </w:r>
           </w:p>
         </w:tc>
@@ -14711,7 +14847,6 @@
                 <w:color w:val="1A1A1A"/>
                 <w:sz w:val="14"/>
               </w:rPr>
-              <w:t>5000002941</w:t>
             </w:r>
           </w:p>
         </w:tc>
@@ -14795,7 +14930,7 @@
                 <w:color w:val="1A1A1A"/>
                 <w:sz w:val="14"/>
               </w:rPr>
-              <w:t>5000000003</w:t>
+              <w:t>5000000002</w:t>
             </w:r>
           </w:p>
         </w:tc>
@@ -14930,7 +15065,7 @@
                 <w:color w:val="1A1A1A"/>
                 <w:sz w:val="14"/>
               </w:rPr>
-              <w:t>-40.50</w:t>
+              <w:t>-84.00</w:t>
             </w:r>
           </w:p>
         </w:tc>
@@ -14957,7 +15092,7 @@
                 <w:color w:val="1A1A1A"/>
                 <w:sz w:val="14"/>
               </w:rPr>
-              <w:t>00010</w:t>
+              <w:t>MKPF</w:t>
             </w:r>
           </w:p>
         </w:tc>
@@ -14984,7 +15119,7 @@
                 <w:color w:val="1A1A1A"/>
                 <w:sz w:val="14"/>
               </w:rPr>
-              <w:t>MKPF</w:t>
+              <w:t>5000002940</w:t>
             </w:r>
           </w:p>
         </w:tc>
@@ -15011,7 +15146,6 @@
                 <w:color w:val="1A1A1A"/>
                 <w:sz w:val="14"/>
               </w:rPr>
-              <w:t>5000002941</w:t>
             </w:r>
           </w:p>
         </w:tc>
@@ -15038,7 +15172,6 @@
                 <w:color w:val="1A1A1A"/>
                 <w:sz w:val="14"/>
               </w:rPr>
-              <w:t>450000214600010</w:t>
             </w:r>
           </w:p>
         </w:tc>
@@ -15096,7 +15229,7 @@
                 <w:color w:val="1A1A1A"/>
                 <w:sz w:val="14"/>
               </w:rPr>
-              <w:t>5100000000</w:t>
+              <w:t>5000000003</w:t>
             </w:r>
           </w:p>
         </w:tc>
@@ -15123,7 +15256,7 @@
                 <w:color w:val="1A1A1A"/>
                 <w:sz w:val="14"/>
               </w:rPr>
-              <w:t>RE</w:t>
+              <w:t>WE</w:t>
             </w:r>
           </w:p>
         </w:tc>
@@ -15177,7 +15310,7 @@
                 <w:color w:val="1A1A1A"/>
                 <w:sz w:val="14"/>
               </w:rPr>
-              <w:t>0021100000</w:t>
+              <w:t>0013600000</w:t>
             </w:r>
           </w:p>
         </w:tc>
@@ -15204,7 +15337,7 @@
                 <w:color w:val="1A1A1A"/>
                 <w:sz w:val="14"/>
               </w:rPr>
-              <w:t>H</w:t>
+              <w:t>S</w:t>
             </w:r>
           </w:p>
         </w:tc>
@@ -15231,7 +15364,7 @@
                 <w:color w:val="1A1A1A"/>
                 <w:sz w:val="14"/>
               </w:rPr>
-              <w:t>-120.00</w:t>
+              <w:t>40.50</w:t>
             </w:r>
           </w:p>
         </w:tc>
@@ -15258,6 +15391,7 @@
                 <w:color w:val="1A1A1A"/>
                 <w:sz w:val="14"/>
               </w:rPr>
+              <w:t>MKPF</w:t>
             </w:r>
           </w:p>
         </w:tc>
@@ -15284,7 +15418,7 @@
                 <w:color w:val="1A1A1A"/>
                 <w:sz w:val="14"/>
               </w:rPr>
-              <w:t>RMRP</w:t>
+              <w:t>5000002941</w:t>
             </w:r>
           </w:p>
         </w:tc>
@@ -15311,7 +15445,6 @@
                 <w:color w:val="1A1A1A"/>
                 <w:sz w:val="14"/>
               </w:rPr>
-              <w:t>5100001598</w:t>
             </w:r>
           </w:p>
         </w:tc>
@@ -15364,7 +15497,6 @@
                 <w:color w:val="1A1A1A"/>
                 <w:sz w:val="14"/>
               </w:rPr>
-              <w:t>INVOICE SUPP.INV.0001</w:t>
             </w:r>
           </w:p>
         </w:tc>
@@ -15396,7 +15528,7 @@
                 <w:color w:val="1A1A1A"/>
                 <w:sz w:val="14"/>
               </w:rPr>
-              <w:t>5100000000</w:t>
+              <w:t>5000000003</w:t>
             </w:r>
           </w:p>
         </w:tc>
@@ -15423,7 +15555,7 @@
                 <w:color w:val="1A1A1A"/>
                 <w:sz w:val="14"/>
               </w:rPr>
-              <w:t>RE</w:t>
+              <w:t>WE</w:t>
             </w:r>
           </w:p>
         </w:tc>
@@ -15504,7 +15636,7 @@
                 <w:color w:val="1A1A1A"/>
                 <w:sz w:val="14"/>
               </w:rPr>
-              <w:t>S</w:t>
+              <w:t>H</w:t>
             </w:r>
           </w:p>
         </w:tc>
@@ -15531,7 +15663,7 @@
                 <w:color w:val="1A1A1A"/>
                 <w:sz w:val="14"/>
               </w:rPr>
-              <w:t>36.00</w:t>
+              <w:t>-40.50</w:t>
             </w:r>
           </w:p>
         </w:tc>
@@ -15558,7 +15690,7 @@
                 <w:color w:val="1A1A1A"/>
                 <w:sz w:val="14"/>
               </w:rPr>
-              <w:t>00020</w:t>
+              <w:t>MKPF</w:t>
             </w:r>
           </w:p>
         </w:tc>
@@ -15585,7 +15717,7 @@
                 <w:color w:val="1A1A1A"/>
                 <w:sz w:val="14"/>
               </w:rPr>
-              <w:t>RMRP</w:t>
+              <w:t>5000002941</w:t>
             </w:r>
           </w:p>
         </w:tc>
@@ -15612,7 +15744,6 @@
                 <w:color w:val="1A1A1A"/>
                 <w:sz w:val="14"/>
               </w:rPr>
-              <w:t>5100001598</w:t>
             </w:r>
           </w:p>
         </w:tc>
@@ -15639,7 +15770,6 @@
                 <w:color w:val="1A1A1A"/>
                 <w:sz w:val="14"/>
               </w:rPr>
-              <w:t>450000214600020</w:t>
             </w:r>
           </w:p>
         </w:tc>
@@ -15751,7 +15881,7 @@
                 <w:color w:val="1A1A1A"/>
                 <w:sz w:val="14"/>
               </w:rPr>
-              <w:t>000003</w:t>
+              <w:t>000001</w:t>
             </w:r>
           </w:p>
         </w:tc>
@@ -15778,7 +15908,7 @@
                 <w:color w:val="1A1A1A"/>
                 <w:sz w:val="14"/>
               </w:rPr>
-              <w:t>0021120000</w:t>
+              <w:t>0021100000</w:t>
             </w:r>
           </w:p>
         </w:tc>
@@ -15805,7 +15935,7 @@
                 <w:color w:val="1A1A1A"/>
                 <w:sz w:val="14"/>
               </w:rPr>
-              <w:t>S</w:t>
+              <w:t>H</w:t>
             </w:r>
           </w:p>
         </w:tc>
@@ -15832,7 +15962,7 @@
                 <w:color w:val="1A1A1A"/>
                 <w:sz w:val="14"/>
               </w:rPr>
-              <w:t>84.00</w:t>
+              <w:t>-120.00</w:t>
             </w:r>
           </w:p>
         </w:tc>
@@ -15859,7 +15989,7 @@
                 <w:color w:val="1A1A1A"/>
                 <w:sz w:val="14"/>
               </w:rPr>
-              <w:t>00020</w:t>
+              <w:t>RMRP</w:t>
             </w:r>
           </w:p>
         </w:tc>
@@ -15886,7 +16016,7 @@
                 <w:color w:val="1A1A1A"/>
                 <w:sz w:val="14"/>
               </w:rPr>
-              <w:t>RMRP</w:t>
+              <w:t>5100001598</w:t>
             </w:r>
           </w:p>
         </w:tc>
@@ -15913,7 +16043,7 @@
                 <w:color w:val="1A1A1A"/>
                 <w:sz w:val="14"/>
               </w:rPr>
-              <w:t>5100001598</w:t>
+              <w:t>1500000000</w:t>
             </w:r>
           </w:p>
         </w:tc>
@@ -15940,7 +16070,7 @@
                 <w:color w:val="1A1A1A"/>
                 <w:sz w:val="14"/>
               </w:rPr>
-              <w:t>450000214600020</w:t>
+              <w:t>20261006</w:t>
             </w:r>
           </w:p>
         </w:tc>
@@ -15967,6 +16097,7 @@
                 <w:color w:val="1A1A1A"/>
                 <w:sz w:val="14"/>
               </w:rPr>
+              <w:t>INVOICE SUPP.INV.0001</w:t>
             </w:r>
           </w:p>
         </w:tc>
@@ -15998,7 +16129,7 @@
                 <w:color w:val="1A1A1A"/>
                 <w:sz w:val="14"/>
               </w:rPr>
-              <w:t>5100000001</w:t>
+              <w:t>5100000000</w:t>
             </w:r>
           </w:p>
         </w:tc>
@@ -16052,7 +16183,7 @@
                 <w:color w:val="1A1A1A"/>
                 <w:sz w:val="14"/>
               </w:rPr>
-              <w:t>000001</w:t>
+              <w:t>000002</w:t>
             </w:r>
           </w:p>
         </w:tc>
@@ -16079,7 +16210,7 @@
                 <w:color w:val="1A1A1A"/>
                 <w:sz w:val="14"/>
               </w:rPr>
-              <w:t>0021100000</w:t>
+              <w:t>0021120000</w:t>
             </w:r>
           </w:p>
         </w:tc>
@@ -16106,7 +16237,7 @@
                 <w:color w:val="1A1A1A"/>
                 <w:sz w:val="14"/>
               </w:rPr>
-              <w:t>H</w:t>
+              <w:t>S</w:t>
             </w:r>
           </w:p>
         </w:tc>
@@ -16133,7 +16264,7 @@
                 <w:color w:val="1A1A1A"/>
                 <w:sz w:val="14"/>
               </w:rPr>
-              <w:t>-40.50</w:t>
+              <w:t>36.00</w:t>
             </w:r>
           </w:p>
         </w:tc>
@@ -16160,6 +16291,7 @@
                 <w:color w:val="1A1A1A"/>
                 <w:sz w:val="14"/>
               </w:rPr>
+              <w:t>RMRP</w:t>
             </w:r>
           </w:p>
         </w:tc>
@@ -16186,7 +16318,7 @@
                 <w:color w:val="1A1A1A"/>
                 <w:sz w:val="14"/>
               </w:rPr>
-              <w:t>RMRP</w:t>
+              <w:t>5100001598</w:t>
             </w:r>
           </w:p>
         </w:tc>
@@ -16213,7 +16345,6 @@
                 <w:color w:val="1A1A1A"/>
                 <w:sz w:val="14"/>
               </w:rPr>
-              <w:t>5100001599</w:t>
             </w:r>
           </w:p>
         </w:tc>
@@ -16266,7 +16397,6 @@
                 <w:color w:val="1A1A1A"/>
                 <w:sz w:val="14"/>
               </w:rPr>
-              <w:t>SUPP.INV.0002</w:t>
             </w:r>
           </w:p>
         </w:tc>
@@ -16298,7 +16428,7 @@
                 <w:color w:val="1A1A1A"/>
                 <w:sz w:val="14"/>
               </w:rPr>
-              <w:t>5100000001</w:t>
+              <w:t>5100000000</w:t>
             </w:r>
           </w:p>
         </w:tc>
@@ -16352,7 +16482,7 @@
                 <w:color w:val="1A1A1A"/>
                 <w:sz w:val="14"/>
               </w:rPr>
-              <w:t>000002</w:t>
+              <w:t>000003</w:t>
             </w:r>
           </w:p>
         </w:tc>
@@ -16433,7 +16563,7 @@
                 <w:color w:val="1A1A1A"/>
                 <w:sz w:val="14"/>
               </w:rPr>
-              <w:t>40.50</w:t>
+              <w:t>84.00</w:t>
             </w:r>
           </w:p>
         </w:tc>
@@ -16460,7 +16590,7 @@
                 <w:color w:val="1A1A1A"/>
                 <w:sz w:val="14"/>
               </w:rPr>
-              <w:t>00010</w:t>
+              <w:t>RMRP</w:t>
             </w:r>
           </w:p>
         </w:tc>
@@ -16487,7 +16617,7 @@
                 <w:color w:val="1A1A1A"/>
                 <w:sz w:val="14"/>
               </w:rPr>
-              <w:t>RMRP</w:t>
+              <w:t>5100001598</w:t>
             </w:r>
           </w:p>
         </w:tc>
@@ -16514,7 +16644,6 @@
                 <w:color w:val="1A1A1A"/>
                 <w:sz w:val="14"/>
               </w:rPr>
-              <w:t>5100001599</w:t>
             </w:r>
           </w:p>
         </w:tc>
@@ -16541,7 +16670,607 @@
                 <w:color w:val="1A1A1A"/>
                 <w:sz w:val="14"/>
               </w:rPr>
-              <w:t>450000214600010</w:t>
+            </w:r>
+          </w:p>
+        </w:tc>
+        <w:tc>
+          <w:tcPr>
+            <w:tcW w:type="dxa" w:w="948"/>
+            <w:shd w:val="clear" w:color="auto" w:fill="FFFFFF"/>
+            <w:tcMar>
+              <w:top w:w="60" w:type="dxa"/>
+              <w:left w:w="60" w:type="dxa"/>
+              <w:bottom w:w="60" w:type="dxa"/>
+              <w:right w:w="60" w:type="dxa"/>
+            </w:tcMar>
+          </w:tcPr>
+          <w:p>
+            <w:pPr>
+              <w:spacing w:before="20" w:after="20"/>
+            </w:pPr>
+            <w:r/>
+            <w:r>
+              <w:rPr>
+                <w:rFonts w:ascii="Calibri" w:hAnsi="Calibri" w:eastAsia="Calibri"/>
+                <w:b w:val="0"/>
+                <w:color w:val="1A1A1A"/>
+                <w:sz w:val="14"/>
+              </w:rPr>
+            </w:r>
+          </w:p>
+        </w:tc>
+      </w:tr>
+      <w:tr>
+        <w:trPr>
+          <w:cantSplit/>
+        </w:trPr>
+        <w:tc>
+          <w:tcPr>
+            <w:tcW w:type="dxa" w:w="948"/>
+            <w:shd w:val="clear" w:color="auto" w:fill="F3F6F9"/>
+            <w:tcMar>
+              <w:top w:w="60" w:type="dxa"/>
+              <w:left w:w="60" w:type="dxa"/>
+              <w:bottom w:w="60" w:type="dxa"/>
+              <w:right w:w="60" w:type="dxa"/>
+            </w:tcMar>
+          </w:tcPr>
+          <w:p>
+            <w:pPr>
+              <w:spacing w:before="20" w:after="20"/>
+            </w:pPr>
+            <w:r/>
+            <w:r>
+              <w:rPr>
+                <w:rFonts w:ascii="Calibri" w:hAnsi="Calibri" w:eastAsia="Calibri"/>
+                <w:b w:val="0"/>
+                <w:color w:val="1A1A1A"/>
+                <w:sz w:val="14"/>
+              </w:rPr>
+              <w:t>5100000001</w:t>
+            </w:r>
+          </w:p>
+        </w:tc>
+        <w:tc>
+          <w:tcPr>
+            <w:tcW w:type="dxa" w:w="948"/>
+            <w:shd w:val="clear" w:color="auto" w:fill="F3F6F9"/>
+            <w:tcMar>
+              <w:top w:w="60" w:type="dxa"/>
+              <w:left w:w="60" w:type="dxa"/>
+              <w:bottom w:w="60" w:type="dxa"/>
+              <w:right w:w="60" w:type="dxa"/>
+            </w:tcMar>
+          </w:tcPr>
+          <w:p>
+            <w:pPr>
+              <w:spacing w:before="20" w:after="20"/>
+            </w:pPr>
+            <w:r/>
+            <w:r>
+              <w:rPr>
+                <w:rFonts w:ascii="Calibri" w:hAnsi="Calibri" w:eastAsia="Calibri"/>
+                <w:b w:val="0"/>
+                <w:color w:val="1A1A1A"/>
+                <w:sz w:val="14"/>
+              </w:rPr>
+              <w:t>RE</w:t>
+            </w:r>
+          </w:p>
+        </w:tc>
+        <w:tc>
+          <w:tcPr>
+            <w:tcW w:type="dxa" w:w="948"/>
+            <w:shd w:val="clear" w:color="auto" w:fill="F3F6F9"/>
+            <w:tcMar>
+              <w:top w:w="60" w:type="dxa"/>
+              <w:left w:w="60" w:type="dxa"/>
+              <w:bottom w:w="60" w:type="dxa"/>
+              <w:right w:w="60" w:type="dxa"/>
+            </w:tcMar>
+          </w:tcPr>
+          <w:p>
+            <w:pPr>
+              <w:spacing w:before="20" w:after="20"/>
+            </w:pPr>
+            <w:r/>
+            <w:r>
+              <w:rPr>
+                <w:rFonts w:ascii="Calibri" w:hAnsi="Calibri" w:eastAsia="Calibri"/>
+                <w:b w:val="0"/>
+                <w:color w:val="1A1A1A"/>
+                <w:sz w:val="14"/>
+              </w:rPr>
+              <w:t>000001</w:t>
+            </w:r>
+          </w:p>
+        </w:tc>
+        <w:tc>
+          <w:tcPr>
+            <w:tcW w:type="dxa" w:w="948"/>
+            <w:shd w:val="clear" w:color="auto" w:fill="F3F6F9"/>
+            <w:tcMar>
+              <w:top w:w="60" w:type="dxa"/>
+              <w:left w:w="60" w:type="dxa"/>
+              <w:bottom w:w="60" w:type="dxa"/>
+              <w:right w:w="60" w:type="dxa"/>
+            </w:tcMar>
+          </w:tcPr>
+          <w:p>
+            <w:pPr>
+              <w:spacing w:before="20" w:after="20"/>
+            </w:pPr>
+            <w:r/>
+            <w:r>
+              <w:rPr>
+                <w:rFonts w:ascii="Calibri" w:hAnsi="Calibri" w:eastAsia="Calibri"/>
+                <w:b w:val="0"/>
+                <w:color w:val="1A1A1A"/>
+                <w:sz w:val="14"/>
+              </w:rPr>
+              <w:t>0021100000</w:t>
+            </w:r>
+          </w:p>
+        </w:tc>
+        <w:tc>
+          <w:tcPr>
+            <w:tcW w:type="dxa" w:w="948"/>
+            <w:shd w:val="clear" w:color="auto" w:fill="F3F6F9"/>
+            <w:tcMar>
+              <w:top w:w="60" w:type="dxa"/>
+              <w:left w:w="60" w:type="dxa"/>
+              <w:bottom w:w="60" w:type="dxa"/>
+              <w:right w:w="60" w:type="dxa"/>
+            </w:tcMar>
+          </w:tcPr>
+          <w:p>
+            <w:pPr>
+              <w:spacing w:before="20" w:after="20"/>
+            </w:pPr>
+            <w:r/>
+            <w:r>
+              <w:rPr>
+                <w:rFonts w:ascii="Calibri" w:hAnsi="Calibri" w:eastAsia="Calibri"/>
+                <w:b w:val="0"/>
+                <w:color w:val="1A1A1A"/>
+                <w:sz w:val="14"/>
+              </w:rPr>
+              <w:t>H</w:t>
+            </w:r>
+          </w:p>
+        </w:tc>
+        <w:tc>
+          <w:tcPr>
+            <w:tcW w:type="dxa" w:w="948"/>
+            <w:shd w:val="clear" w:color="auto" w:fill="F3F6F9"/>
+            <w:tcMar>
+              <w:top w:w="60" w:type="dxa"/>
+              <w:left w:w="60" w:type="dxa"/>
+              <w:bottom w:w="60" w:type="dxa"/>
+              <w:right w:w="60" w:type="dxa"/>
+            </w:tcMar>
+          </w:tcPr>
+          <w:p>
+            <w:pPr>
+              <w:spacing w:before="20" w:after="20"/>
+            </w:pPr>
+            <w:r/>
+            <w:r>
+              <w:rPr>
+                <w:rFonts w:ascii="Calibri" w:hAnsi="Calibri" w:eastAsia="Calibri"/>
+                <w:b w:val="0"/>
+                <w:color w:val="1A1A1A"/>
+                <w:sz w:val="14"/>
+              </w:rPr>
+              <w:t>-40.50</w:t>
+            </w:r>
+          </w:p>
+        </w:tc>
+        <w:tc>
+          <w:tcPr>
+            <w:tcW w:type="dxa" w:w="948"/>
+            <w:shd w:val="clear" w:color="auto" w:fill="F3F6F9"/>
+            <w:tcMar>
+              <w:top w:w="60" w:type="dxa"/>
+              <w:left w:w="60" w:type="dxa"/>
+              <w:bottom w:w="60" w:type="dxa"/>
+              <w:right w:w="60" w:type="dxa"/>
+            </w:tcMar>
+          </w:tcPr>
+          <w:p>
+            <w:pPr>
+              <w:spacing w:before="20" w:after="20"/>
+            </w:pPr>
+            <w:r/>
+            <w:r>
+              <w:rPr>
+                <w:rFonts w:ascii="Calibri" w:hAnsi="Calibri" w:eastAsia="Calibri"/>
+                <w:b w:val="0"/>
+                <w:color w:val="1A1A1A"/>
+                <w:sz w:val="14"/>
+              </w:rPr>
+              <w:t>RMRP</w:t>
+            </w:r>
+          </w:p>
+        </w:tc>
+        <w:tc>
+          <w:tcPr>
+            <w:tcW w:type="dxa" w:w="948"/>
+            <w:shd w:val="clear" w:color="auto" w:fill="F3F6F9"/>
+            <w:tcMar>
+              <w:top w:w="60" w:type="dxa"/>
+              <w:left w:w="60" w:type="dxa"/>
+              <w:bottom w:w="60" w:type="dxa"/>
+              <w:right w:w="60" w:type="dxa"/>
+            </w:tcMar>
+          </w:tcPr>
+          <w:p>
+            <w:pPr>
+              <w:spacing w:before="20" w:after="20"/>
+            </w:pPr>
+            <w:r/>
+            <w:r>
+              <w:rPr>
+                <w:rFonts w:ascii="Calibri" w:hAnsi="Calibri" w:eastAsia="Calibri"/>
+                <w:b w:val="0"/>
+                <w:color w:val="1A1A1A"/>
+                <w:sz w:val="14"/>
+              </w:rPr>
+              <w:t>5100001599</w:t>
+            </w:r>
+          </w:p>
+        </w:tc>
+        <w:tc>
+          <w:tcPr>
+            <w:tcW w:type="dxa" w:w="948"/>
+            <w:shd w:val="clear" w:color="auto" w:fill="F3F6F9"/>
+            <w:tcMar>
+              <w:top w:w="60" w:type="dxa"/>
+              <w:left w:w="60" w:type="dxa"/>
+              <w:bottom w:w="60" w:type="dxa"/>
+              <w:right w:w="60" w:type="dxa"/>
+            </w:tcMar>
+          </w:tcPr>
+          <w:p>
+            <w:pPr>
+              <w:spacing w:before="20" w:after="20"/>
+            </w:pPr>
+            <w:r/>
+            <w:r>
+              <w:rPr>
+                <w:rFonts w:ascii="Calibri" w:hAnsi="Calibri" w:eastAsia="Calibri"/>
+                <w:b w:val="0"/>
+                <w:color w:val="1A1A1A"/>
+                <w:sz w:val="14"/>
+              </w:rPr>
+              <w:t>1500000000</w:t>
+            </w:r>
+          </w:p>
+        </w:tc>
+        <w:tc>
+          <w:tcPr>
+            <w:tcW w:type="dxa" w:w="948"/>
+            <w:shd w:val="clear" w:color="auto" w:fill="F3F6F9"/>
+            <w:tcMar>
+              <w:top w:w="60" w:type="dxa"/>
+              <w:left w:w="60" w:type="dxa"/>
+              <w:bottom w:w="60" w:type="dxa"/>
+              <w:right w:w="60" w:type="dxa"/>
+            </w:tcMar>
+          </w:tcPr>
+          <w:p>
+            <w:pPr>
+              <w:spacing w:before="20" w:after="20"/>
+            </w:pPr>
+            <w:r/>
+            <w:r>
+              <w:rPr>
+                <w:rFonts w:ascii="Calibri" w:hAnsi="Calibri" w:eastAsia="Calibri"/>
+                <w:b w:val="0"/>
+                <w:color w:val="1A1A1A"/>
+                <w:sz w:val="14"/>
+              </w:rPr>
+              <w:t>20261006</w:t>
+            </w:r>
+          </w:p>
+        </w:tc>
+        <w:tc>
+          <w:tcPr>
+            <w:tcW w:type="dxa" w:w="948"/>
+            <w:shd w:val="clear" w:color="auto" w:fill="F3F6F9"/>
+            <w:tcMar>
+              <w:top w:w="60" w:type="dxa"/>
+              <w:left w:w="60" w:type="dxa"/>
+              <w:bottom w:w="60" w:type="dxa"/>
+              <w:right w:w="60" w:type="dxa"/>
+            </w:tcMar>
+          </w:tcPr>
+          <w:p>
+            <w:pPr>
+              <w:spacing w:before="20" w:after="20"/>
+            </w:pPr>
+            <w:r/>
+            <w:r>
+              <w:rPr>
+                <w:rFonts w:ascii="Calibri" w:hAnsi="Calibri" w:eastAsia="Calibri"/>
+                <w:b w:val="0"/>
+                <w:color w:val="1A1A1A"/>
+                <w:sz w:val="14"/>
+              </w:rPr>
+              <w:t>SUPP.INV.0002</w:t>
+            </w:r>
+          </w:p>
+        </w:tc>
+      </w:tr>
+      <w:tr>
+        <w:trPr>
+          <w:cantSplit/>
+        </w:trPr>
+        <w:tc>
+          <w:tcPr>
+            <w:tcW w:type="dxa" w:w="948"/>
+            <w:shd w:val="clear" w:color="auto" w:fill="FFFFFF"/>
+            <w:tcMar>
+              <w:top w:w="60" w:type="dxa"/>
+              <w:left w:w="60" w:type="dxa"/>
+              <w:bottom w:w="60" w:type="dxa"/>
+              <w:right w:w="60" w:type="dxa"/>
+            </w:tcMar>
+          </w:tcPr>
+          <w:p>
+            <w:pPr>
+              <w:spacing w:before="20" w:after="20"/>
+            </w:pPr>
+            <w:r/>
+            <w:r>
+              <w:rPr>
+                <w:rFonts w:ascii="Calibri" w:hAnsi="Calibri" w:eastAsia="Calibri"/>
+                <w:b w:val="0"/>
+                <w:color w:val="1A1A1A"/>
+                <w:sz w:val="14"/>
+              </w:rPr>
+              <w:t>5100000001</w:t>
+            </w:r>
+          </w:p>
+        </w:tc>
+        <w:tc>
+          <w:tcPr>
+            <w:tcW w:type="dxa" w:w="948"/>
+            <w:shd w:val="clear" w:color="auto" w:fill="FFFFFF"/>
+            <w:tcMar>
+              <w:top w:w="60" w:type="dxa"/>
+              <w:left w:w="60" w:type="dxa"/>
+              <w:bottom w:w="60" w:type="dxa"/>
+              <w:right w:w="60" w:type="dxa"/>
+            </w:tcMar>
+          </w:tcPr>
+          <w:p>
+            <w:pPr>
+              <w:spacing w:before="20" w:after="20"/>
+            </w:pPr>
+            <w:r/>
+            <w:r>
+              <w:rPr>
+                <w:rFonts w:ascii="Calibri" w:hAnsi="Calibri" w:eastAsia="Calibri"/>
+                <w:b w:val="0"/>
+                <w:color w:val="1A1A1A"/>
+                <w:sz w:val="14"/>
+              </w:rPr>
+              <w:t>RE</w:t>
+            </w:r>
+          </w:p>
+        </w:tc>
+        <w:tc>
+          <w:tcPr>
+            <w:tcW w:type="dxa" w:w="948"/>
+            <w:shd w:val="clear" w:color="auto" w:fill="FFFFFF"/>
+            <w:tcMar>
+              <w:top w:w="60" w:type="dxa"/>
+              <w:left w:w="60" w:type="dxa"/>
+              <w:bottom w:w="60" w:type="dxa"/>
+              <w:right w:w="60" w:type="dxa"/>
+            </w:tcMar>
+          </w:tcPr>
+          <w:p>
+            <w:pPr>
+              <w:spacing w:before="20" w:after="20"/>
+            </w:pPr>
+            <w:r/>
+            <w:r>
+              <w:rPr>
+                <w:rFonts w:ascii="Calibri" w:hAnsi="Calibri" w:eastAsia="Calibri"/>
+                <w:b w:val="0"/>
+                <w:color w:val="1A1A1A"/>
+                <w:sz w:val="14"/>
+              </w:rPr>
+              <w:t>000002</w:t>
+            </w:r>
+          </w:p>
+        </w:tc>
+        <w:tc>
+          <w:tcPr>
+            <w:tcW w:type="dxa" w:w="948"/>
+            <w:shd w:val="clear" w:color="auto" w:fill="FFFFFF"/>
+            <w:tcMar>
+              <w:top w:w="60" w:type="dxa"/>
+              <w:left w:w="60" w:type="dxa"/>
+              <w:bottom w:w="60" w:type="dxa"/>
+              <w:right w:w="60" w:type="dxa"/>
+            </w:tcMar>
+          </w:tcPr>
+          <w:p>
+            <w:pPr>
+              <w:spacing w:before="20" w:after="20"/>
+            </w:pPr>
+            <w:r/>
+            <w:r>
+              <w:rPr>
+                <w:rFonts w:ascii="Calibri" w:hAnsi="Calibri" w:eastAsia="Calibri"/>
+                <w:b w:val="0"/>
+                <w:color w:val="1A1A1A"/>
+                <w:sz w:val="14"/>
+              </w:rPr>
+              <w:t>0021120000</w:t>
+            </w:r>
+          </w:p>
+        </w:tc>
+        <w:tc>
+          <w:tcPr>
+            <w:tcW w:type="dxa" w:w="948"/>
+            <w:shd w:val="clear" w:color="auto" w:fill="FFFFFF"/>
+            <w:tcMar>
+              <w:top w:w="60" w:type="dxa"/>
+              <w:left w:w="60" w:type="dxa"/>
+              <w:bottom w:w="60" w:type="dxa"/>
+              <w:right w:w="60" w:type="dxa"/>
+            </w:tcMar>
+          </w:tcPr>
+          <w:p>
+            <w:pPr>
+              <w:spacing w:before="20" w:after="20"/>
+            </w:pPr>
+            <w:r/>
+            <w:r>
+              <w:rPr>
+                <w:rFonts w:ascii="Calibri" w:hAnsi="Calibri" w:eastAsia="Calibri"/>
+                <w:b w:val="0"/>
+                <w:color w:val="1A1A1A"/>
+                <w:sz w:val="14"/>
+              </w:rPr>
+              <w:t>S</w:t>
+            </w:r>
+          </w:p>
+        </w:tc>
+        <w:tc>
+          <w:tcPr>
+            <w:tcW w:type="dxa" w:w="948"/>
+            <w:shd w:val="clear" w:color="auto" w:fill="FFFFFF"/>
+            <w:tcMar>
+              <w:top w:w="60" w:type="dxa"/>
+              <w:left w:w="60" w:type="dxa"/>
+              <w:bottom w:w="60" w:type="dxa"/>
+              <w:right w:w="60" w:type="dxa"/>
+            </w:tcMar>
+          </w:tcPr>
+          <w:p>
+            <w:pPr>
+              <w:spacing w:before="20" w:after="20"/>
+            </w:pPr>
+            <w:r/>
+            <w:r>
+              <w:rPr>
+                <w:rFonts w:ascii="Calibri" w:hAnsi="Calibri" w:eastAsia="Calibri"/>
+                <w:b w:val="0"/>
+                <w:color w:val="1A1A1A"/>
+                <w:sz w:val="14"/>
+              </w:rPr>
+              <w:t>40.50</w:t>
+            </w:r>
+          </w:p>
+        </w:tc>
+        <w:tc>
+          <w:tcPr>
+            <w:tcW w:type="dxa" w:w="948"/>
+            <w:shd w:val="clear" w:color="auto" w:fill="FFFFFF"/>
+            <w:tcMar>
+              <w:top w:w="60" w:type="dxa"/>
+              <w:left w:w="60" w:type="dxa"/>
+              <w:bottom w:w="60" w:type="dxa"/>
+              <w:right w:w="60" w:type="dxa"/>
+            </w:tcMar>
+          </w:tcPr>
+          <w:p>
+            <w:pPr>
+              <w:spacing w:before="20" w:after="20"/>
+            </w:pPr>
+            <w:r/>
+            <w:r>
+              <w:rPr>
+                <w:rFonts w:ascii="Calibri" w:hAnsi="Calibri" w:eastAsia="Calibri"/>
+                <w:b w:val="0"/>
+                <w:color w:val="1A1A1A"/>
+                <w:sz w:val="14"/>
+              </w:rPr>
+              <w:t>RMRP</w:t>
+            </w:r>
+          </w:p>
+        </w:tc>
+        <w:tc>
+          <w:tcPr>
+            <w:tcW w:type="dxa" w:w="948"/>
+            <w:shd w:val="clear" w:color="auto" w:fill="FFFFFF"/>
+            <w:tcMar>
+              <w:top w:w="60" w:type="dxa"/>
+              <w:left w:w="60" w:type="dxa"/>
+              <w:bottom w:w="60" w:type="dxa"/>
+              <w:right w:w="60" w:type="dxa"/>
+            </w:tcMar>
+          </w:tcPr>
+          <w:p>
+            <w:pPr>
+              <w:spacing w:before="20" w:after="20"/>
+            </w:pPr>
+            <w:r/>
+            <w:r>
+              <w:rPr>
+                <w:rFonts w:ascii="Calibri" w:hAnsi="Calibri" w:eastAsia="Calibri"/>
+                <w:b w:val="0"/>
+                <w:color w:val="1A1A1A"/>
+                <w:sz w:val="14"/>
+              </w:rPr>
+              <w:t>5100001599</w:t>
+            </w:r>
+          </w:p>
+        </w:tc>
+        <w:tc>
+          <w:tcPr>
+            <w:tcW w:type="dxa" w:w="948"/>
+            <w:shd w:val="clear" w:color="auto" w:fill="FFFFFF"/>
+            <w:tcMar>
+              <w:top w:w="60" w:type="dxa"/>
+              <w:left w:w="60" w:type="dxa"/>
+              <w:bottom w:w="60" w:type="dxa"/>
+              <w:right w:w="60" w:type="dxa"/>
+            </w:tcMar>
+          </w:tcPr>
+          <w:p>
+            <w:pPr>
+              <w:spacing w:before="20" w:after="20"/>
+            </w:pPr>
+            <w:r/>
+            <w:r>
+              <w:rPr>
+                <w:rFonts w:ascii="Calibri" w:hAnsi="Calibri" w:eastAsia="Calibri"/>
+                <w:b w:val="0"/>
+                <w:color w:val="1A1A1A"/>
+                <w:sz w:val="14"/>
+              </w:rPr>
+            </w:r>
+          </w:p>
+        </w:tc>
+        <w:tc>
+          <w:tcPr>
+            <w:tcW w:type="dxa" w:w="948"/>
+            <w:shd w:val="clear" w:color="auto" w:fill="FFFFFF"/>
+            <w:tcMar>
+              <w:top w:w="60" w:type="dxa"/>
+              <w:left w:w="60" w:type="dxa"/>
+              <w:bottom w:w="60" w:type="dxa"/>
+              <w:right w:w="60" w:type="dxa"/>
+            </w:tcMar>
+          </w:tcPr>
+          <w:p>
+            <w:pPr>
+              <w:spacing w:before="20" w:after="20"/>
+            </w:pPr>
+            <w:r/>
+            <w:r>
+              <w:rPr>
+                <w:rFonts w:ascii="Calibri" w:hAnsi="Calibri" w:eastAsia="Calibri"/>
+                <w:b w:val="0"/>
+                <w:color w:val="1A1A1A"/>
+                <w:sz w:val="14"/>
+              </w:rPr>
             </w:r>
           </w:p>
         </w:tc>
@@ -16589,7 +17318,7 @@
           <w:color w:val="1A1A1A"/>
           <w:sz w:val="22"/>
         </w:rPr>
-        <w:t>Goods-receipt documents 5000000001, 5000000002, and 5000000003 debit stock and credit GR/IR. Invoice documents 5100000000 and 5100000001 debit GR/IR and credit payables. GR/IR nets to 0.00 for the quantities that were received and invoiced. ClearingDate is 00000000 and ClearingAccountingDocument is blank on every line.</w:t>
+        <w:t>Goods-receipt documents 5000000001, 5000000002, and 5000000003 debit stock and credit GR/IR. Invoice documents 5100000000 and 5100000001 debit GR/IR and credit payables. GR/IR nets to 0.00 for the quantities that were received and invoiced. The two invoice vendor lines are cleared by payment document 1500000000.</w:t>
       </w:r>
     </w:p>
     <w:p>
@@ -18086,7 +18815,7 @@
           <w:color w:val="1A1A1A"/>
           <w:sz w:val="22"/>
         </w:rPr>
-        <w:t>Open vendor balance on G/L account 0021100000: 160.50 USD. That is invoice 5100001598 (120.00) plus invoice 5100001599 (40.50). GR/IR net amount is 0.00 USD.</w:t>
+        <w:t>Vendor payment 1500000000 (document type KZ), posting date 20261006, amount 160.50 USD. Vendor balance on 0021100000 after clearing: 0.00 USD. GR/IR net amount is 0.00 USD.</w:t>
       </w:r>
     </w:p>
     <w:p>
@@ -18100,8 +18829,1327 @@
           <w:color w:val="1A1A1A"/>
           <w:sz w:val="22"/>
         </w:rPr>
-        <w:t>No payment or clearing document is in this extract. ClearingDate and ClearingAccountingDocument are blank on every journal line of the seed. The vendor items on 21100000 remain open.</w:t>
+        <w:t>Accounting document 1500000000 type KZ, posted 20261006, pays 160.50 USD. It credits G/L 0011002000 (external 11002000) and debits vendor account 0021100000 for supplier 0001000559. ClearingAccountingDocument 1500000000 is on the payment vendor line and on both invoice vendor lines, so invoices 5100001598 (120.00) and 5100001599 (40.50) are cleared. The vendor balance on 0021100000 is 0.00.</w:t>
       </w:r>
+    </w:p>
+    <w:p>
+      <w:pPr>
+        <w:spacing w:after="80" w:before="0" w:line="259" w:lineRule="auto"/>
+      </w:pPr>
+      <w:r>
+        <w:rPr>
+          <w:rFonts w:ascii="Calibri" w:hAnsi="Calibri" w:eastAsia="Calibri"/>
+          <w:b/>
+          <w:color w:val="1A1A1A"/>
+          <w:sz w:val="22"/>
+        </w:rPr>
+        <w:t>Payment lines (I_GLAccountLineItemRawData, ledger 0L)</w:t>
+      </w:r>
+    </w:p>
+    <w:tbl>
+      <w:tblPr>
+        <w:tblStyle w:val="TableGrid"/>
+        <w:tblW w:type="auto" w:w="0"/>
+        <w:jc w:val="center"/>
+        <w:tblLayout w:type="autofit"/>
+        <w:tblLook w:firstColumn="1" w:firstRow="1" w:lastColumn="0" w:lastRow="0" w:noHBand="0" w:noVBand="1" w:val="04A0"/>
+      </w:tblPr>
+      <w:tblGrid>
+        <w:gridCol w:w="1158"/>
+        <w:gridCol w:w="1158"/>
+        <w:gridCol w:w="1158"/>
+        <w:gridCol w:w="1158"/>
+        <w:gridCol w:w="1158"/>
+        <w:gridCol w:w="1158"/>
+        <w:gridCol w:w="1158"/>
+        <w:gridCol w:w="1158"/>
+        <w:gridCol w:w="1158"/>
+      </w:tblGrid>
+      <w:tr>
+        <w:trPr>
+          <w:tblHeader/>
+          <w:cantSplit/>
+        </w:trPr>
+        <w:tc>
+          <w:tcPr>
+            <w:tcW w:type="dxa" w:w="1158"/>
+            <w:shd w:val="clear" w:color="auto" w:fill="1F4E79"/>
+            <w:tcMar>
+              <w:top w:w="60" w:type="dxa"/>
+              <w:left w:w="60" w:type="dxa"/>
+              <w:bottom w:w="60" w:type="dxa"/>
+              <w:right w:w="60" w:type="dxa"/>
+            </w:tcMar>
+          </w:tcPr>
+          <w:p>
+            <w:pPr>
+              <w:spacing w:before="20" w:after="20"/>
+            </w:pPr>
+            <w:r/>
+            <w:r>
+              <w:rPr>
+                <w:rFonts w:ascii="Calibri" w:hAnsi="Calibri" w:eastAsia="Calibri"/>
+                <w:b/>
+                <w:color w:val="FFFFFF"/>
+                <w:sz w:val="16"/>
+              </w:rPr>
+              <w:t>FI document</w:t>
+            </w:r>
+          </w:p>
+        </w:tc>
+        <w:tc>
+          <w:tcPr>
+            <w:tcW w:type="dxa" w:w="1158"/>
+            <w:shd w:val="clear" w:color="auto" w:fill="1F4E79"/>
+            <w:tcMar>
+              <w:top w:w="60" w:type="dxa"/>
+              <w:left w:w="60" w:type="dxa"/>
+              <w:bottom w:w="60" w:type="dxa"/>
+              <w:right w:w="60" w:type="dxa"/>
+            </w:tcMar>
+          </w:tcPr>
+          <w:p>
+            <w:pPr>
+              <w:spacing w:before="20" w:after="20"/>
+            </w:pPr>
+            <w:r/>
+            <w:r>
+              <w:rPr>
+                <w:rFonts w:ascii="Calibri" w:hAnsi="Calibri" w:eastAsia="Calibri"/>
+                <w:b/>
+                <w:color w:val="FFFFFF"/>
+                <w:sz w:val="16"/>
+              </w:rPr>
+              <w:t>Line</w:t>
+            </w:r>
+          </w:p>
+        </w:tc>
+        <w:tc>
+          <w:tcPr>
+            <w:tcW w:type="dxa" w:w="1158"/>
+            <w:shd w:val="clear" w:color="auto" w:fill="1F4E79"/>
+            <w:tcMar>
+              <w:top w:w="60" w:type="dxa"/>
+              <w:left w:w="60" w:type="dxa"/>
+              <w:bottom w:w="60" w:type="dxa"/>
+              <w:right w:w="60" w:type="dxa"/>
+            </w:tcMar>
+          </w:tcPr>
+          <w:p>
+            <w:pPr>
+              <w:spacing w:before="20" w:after="20"/>
+            </w:pPr>
+            <w:r/>
+            <w:r>
+              <w:rPr>
+                <w:rFonts w:ascii="Calibri" w:hAnsi="Calibri" w:eastAsia="Calibri"/>
+                <w:b/>
+                <w:color w:val="FFFFFF"/>
+                <w:sz w:val="16"/>
+              </w:rPr>
+              <w:t>G/L account</w:t>
+            </w:r>
+          </w:p>
+        </w:tc>
+        <w:tc>
+          <w:tcPr>
+            <w:tcW w:type="dxa" w:w="1158"/>
+            <w:shd w:val="clear" w:color="auto" w:fill="1F4E79"/>
+            <w:tcMar>
+              <w:top w:w="60" w:type="dxa"/>
+              <w:left w:w="60" w:type="dxa"/>
+              <w:bottom w:w="60" w:type="dxa"/>
+              <w:right w:w="60" w:type="dxa"/>
+            </w:tcMar>
+          </w:tcPr>
+          <w:p>
+            <w:pPr>
+              <w:spacing w:before="20" w:after="20"/>
+            </w:pPr>
+            <w:r/>
+            <w:r>
+              <w:rPr>
+                <w:rFonts w:ascii="Calibri" w:hAnsi="Calibri" w:eastAsia="Calibri"/>
+                <w:b/>
+                <w:color w:val="FFFFFF"/>
+                <w:sz w:val="16"/>
+              </w:rPr>
+              <w:t>D/C</w:t>
+            </w:r>
+          </w:p>
+        </w:tc>
+        <w:tc>
+          <w:tcPr>
+            <w:tcW w:type="dxa" w:w="1158"/>
+            <w:shd w:val="clear" w:color="auto" w:fill="1F4E79"/>
+            <w:tcMar>
+              <w:top w:w="60" w:type="dxa"/>
+              <w:left w:w="60" w:type="dxa"/>
+              <w:bottom w:w="60" w:type="dxa"/>
+              <w:right w:w="60" w:type="dxa"/>
+            </w:tcMar>
+          </w:tcPr>
+          <w:p>
+            <w:pPr>
+              <w:spacing w:before="20" w:after="20"/>
+            </w:pPr>
+            <w:r/>
+            <w:r>
+              <w:rPr>
+                <w:rFonts w:ascii="Calibri" w:hAnsi="Calibri" w:eastAsia="Calibri"/>
+                <w:b/>
+                <w:color w:val="FFFFFF"/>
+                <w:sz w:val="16"/>
+              </w:rPr>
+              <w:t>Amount USD</w:t>
+            </w:r>
+          </w:p>
+        </w:tc>
+        <w:tc>
+          <w:tcPr>
+            <w:tcW w:type="dxa" w:w="1158"/>
+            <w:shd w:val="clear" w:color="auto" w:fill="1F4E79"/>
+            <w:tcMar>
+              <w:top w:w="60" w:type="dxa"/>
+              <w:left w:w="60" w:type="dxa"/>
+              <w:bottom w:w="60" w:type="dxa"/>
+              <w:right w:w="60" w:type="dxa"/>
+            </w:tcMar>
+          </w:tcPr>
+          <w:p>
+            <w:pPr>
+              <w:spacing w:before="20" w:after="20"/>
+            </w:pPr>
+            <w:r/>
+            <w:r>
+              <w:rPr>
+                <w:rFonts w:ascii="Calibri" w:hAnsi="Calibri" w:eastAsia="Calibri"/>
+                <w:b/>
+                <w:color w:val="FFFFFF"/>
+                <w:sz w:val="16"/>
+              </w:rPr>
+              <w:t>Supplier</w:t>
+            </w:r>
+          </w:p>
+        </w:tc>
+        <w:tc>
+          <w:tcPr>
+            <w:tcW w:type="dxa" w:w="1158"/>
+            <w:shd w:val="clear" w:color="auto" w:fill="1F4E79"/>
+            <w:tcMar>
+              <w:top w:w="60" w:type="dxa"/>
+              <w:left w:w="60" w:type="dxa"/>
+              <w:bottom w:w="60" w:type="dxa"/>
+              <w:right w:w="60" w:type="dxa"/>
+            </w:tcMar>
+          </w:tcPr>
+          <w:p>
+            <w:pPr>
+              <w:spacing w:before="20" w:after="20"/>
+            </w:pPr>
+            <w:r/>
+            <w:r>
+              <w:rPr>
+                <w:rFonts w:ascii="Calibri" w:hAnsi="Calibri" w:eastAsia="Calibri"/>
+                <w:b/>
+                <w:color w:val="FFFFFF"/>
+                <w:sz w:val="16"/>
+              </w:rPr>
+              <w:t>Offsetting account</w:t>
+            </w:r>
+          </w:p>
+        </w:tc>
+        <w:tc>
+          <w:tcPr>
+            <w:tcW w:type="dxa" w:w="1158"/>
+            <w:shd w:val="clear" w:color="auto" w:fill="1F4E79"/>
+            <w:tcMar>
+              <w:top w:w="60" w:type="dxa"/>
+              <w:left w:w="60" w:type="dxa"/>
+              <w:bottom w:w="60" w:type="dxa"/>
+              <w:right w:w="60" w:type="dxa"/>
+            </w:tcMar>
+          </w:tcPr>
+          <w:p>
+            <w:pPr>
+              <w:spacing w:before="20" w:after="20"/>
+            </w:pPr>
+            <w:r/>
+            <w:r>
+              <w:rPr>
+                <w:rFonts w:ascii="Calibri" w:hAnsi="Calibri" w:eastAsia="Calibri"/>
+                <w:b/>
+                <w:color w:val="FFFFFF"/>
+                <w:sz w:val="16"/>
+              </w:rPr>
+              <w:t>Clearing doc</w:t>
+            </w:r>
+          </w:p>
+        </w:tc>
+        <w:tc>
+          <w:tcPr>
+            <w:tcW w:type="dxa" w:w="1158"/>
+            <w:shd w:val="clear" w:color="auto" w:fill="1F4E79"/>
+            <w:tcMar>
+              <w:top w:w="60" w:type="dxa"/>
+              <w:left w:w="60" w:type="dxa"/>
+              <w:bottom w:w="60" w:type="dxa"/>
+              <w:right w:w="60" w:type="dxa"/>
+            </w:tcMar>
+          </w:tcPr>
+          <w:p>
+            <w:pPr>
+              <w:spacing w:before="20" w:after="20"/>
+            </w:pPr>
+            <w:r/>
+            <w:r>
+              <w:rPr>
+                <w:rFonts w:ascii="Calibri" w:hAnsi="Calibri" w:eastAsia="Calibri"/>
+                <w:b/>
+                <w:color w:val="FFFFFF"/>
+                <w:sz w:val="16"/>
+              </w:rPr>
+              <w:t>Clearing date</w:t>
+            </w:r>
+          </w:p>
+        </w:tc>
+      </w:tr>
+      <w:tr>
+        <w:trPr>
+          <w:cantSplit/>
+        </w:trPr>
+        <w:tc>
+          <w:tcPr>
+            <w:tcW w:type="dxa" w:w="1158"/>
+            <w:shd w:val="clear" w:color="auto" w:fill="FFFFFF"/>
+            <w:tcMar>
+              <w:top w:w="60" w:type="dxa"/>
+              <w:left w:w="60" w:type="dxa"/>
+              <w:bottom w:w="60" w:type="dxa"/>
+              <w:right w:w="60" w:type="dxa"/>
+            </w:tcMar>
+          </w:tcPr>
+          <w:p>
+            <w:pPr>
+              <w:spacing w:before="20" w:after="20"/>
+            </w:pPr>
+            <w:r/>
+            <w:r>
+              <w:rPr>
+                <w:rFonts w:ascii="Calibri" w:hAnsi="Calibri" w:eastAsia="Calibri"/>
+                <w:b w:val="0"/>
+                <w:color w:val="1A1A1A"/>
+                <w:sz w:val="16"/>
+              </w:rPr>
+              <w:t>1500000000</w:t>
+            </w:r>
+          </w:p>
+        </w:tc>
+        <w:tc>
+          <w:tcPr>
+            <w:tcW w:type="dxa" w:w="1158"/>
+            <w:shd w:val="clear" w:color="auto" w:fill="FFFFFF"/>
+            <w:tcMar>
+              <w:top w:w="60" w:type="dxa"/>
+              <w:left w:w="60" w:type="dxa"/>
+              <w:bottom w:w="60" w:type="dxa"/>
+              <w:right w:w="60" w:type="dxa"/>
+            </w:tcMar>
+          </w:tcPr>
+          <w:p>
+            <w:pPr>
+              <w:spacing w:before="20" w:after="20"/>
+            </w:pPr>
+            <w:r/>
+            <w:r>
+              <w:rPr>
+                <w:rFonts w:ascii="Calibri" w:hAnsi="Calibri" w:eastAsia="Calibri"/>
+                <w:b w:val="0"/>
+                <w:color w:val="1A1A1A"/>
+                <w:sz w:val="16"/>
+              </w:rPr>
+              <w:t>000001</w:t>
+            </w:r>
+          </w:p>
+        </w:tc>
+        <w:tc>
+          <w:tcPr>
+            <w:tcW w:type="dxa" w:w="1158"/>
+            <w:shd w:val="clear" w:color="auto" w:fill="FFFFFF"/>
+            <w:tcMar>
+              <w:top w:w="60" w:type="dxa"/>
+              <w:left w:w="60" w:type="dxa"/>
+              <w:bottom w:w="60" w:type="dxa"/>
+              <w:right w:w="60" w:type="dxa"/>
+            </w:tcMar>
+          </w:tcPr>
+          <w:p>
+            <w:pPr>
+              <w:spacing w:before="20" w:after="20"/>
+            </w:pPr>
+            <w:r/>
+            <w:r>
+              <w:rPr>
+                <w:rFonts w:ascii="Calibri" w:hAnsi="Calibri" w:eastAsia="Calibri"/>
+                <w:b w:val="0"/>
+                <w:color w:val="1A1A1A"/>
+                <w:sz w:val="16"/>
+              </w:rPr>
+              <w:t>0011002000</w:t>
+            </w:r>
+          </w:p>
+        </w:tc>
+        <w:tc>
+          <w:tcPr>
+            <w:tcW w:type="dxa" w:w="1158"/>
+            <w:shd w:val="clear" w:color="auto" w:fill="FFFFFF"/>
+            <w:tcMar>
+              <w:top w:w="60" w:type="dxa"/>
+              <w:left w:w="60" w:type="dxa"/>
+              <w:bottom w:w="60" w:type="dxa"/>
+              <w:right w:w="60" w:type="dxa"/>
+            </w:tcMar>
+          </w:tcPr>
+          <w:p>
+            <w:pPr>
+              <w:spacing w:before="20" w:after="20"/>
+            </w:pPr>
+            <w:r/>
+            <w:r>
+              <w:rPr>
+                <w:rFonts w:ascii="Calibri" w:hAnsi="Calibri" w:eastAsia="Calibri"/>
+                <w:b w:val="0"/>
+                <w:color w:val="1A1A1A"/>
+                <w:sz w:val="16"/>
+              </w:rPr>
+              <w:t>H</w:t>
+            </w:r>
+          </w:p>
+        </w:tc>
+        <w:tc>
+          <w:tcPr>
+            <w:tcW w:type="dxa" w:w="1158"/>
+            <w:shd w:val="clear" w:color="auto" w:fill="FFFFFF"/>
+            <w:tcMar>
+              <w:top w:w="60" w:type="dxa"/>
+              <w:left w:w="60" w:type="dxa"/>
+              <w:bottom w:w="60" w:type="dxa"/>
+              <w:right w:w="60" w:type="dxa"/>
+            </w:tcMar>
+          </w:tcPr>
+          <w:p>
+            <w:pPr>
+              <w:spacing w:before="20" w:after="20"/>
+            </w:pPr>
+            <w:r/>
+            <w:r>
+              <w:rPr>
+                <w:rFonts w:ascii="Calibri" w:hAnsi="Calibri" w:eastAsia="Calibri"/>
+                <w:b w:val="0"/>
+                <w:color w:val="1A1A1A"/>
+                <w:sz w:val="16"/>
+              </w:rPr>
+              <w:t>-160.50</w:t>
+            </w:r>
+          </w:p>
+        </w:tc>
+        <w:tc>
+          <w:tcPr>
+            <w:tcW w:type="dxa" w:w="1158"/>
+            <w:shd w:val="clear" w:color="auto" w:fill="FFFFFF"/>
+            <w:tcMar>
+              <w:top w:w="60" w:type="dxa"/>
+              <w:left w:w="60" w:type="dxa"/>
+              <w:bottom w:w="60" w:type="dxa"/>
+              <w:right w:w="60" w:type="dxa"/>
+            </w:tcMar>
+          </w:tcPr>
+          <w:p>
+            <w:pPr>
+              <w:spacing w:before="20" w:after="20"/>
+            </w:pPr>
+            <w:r/>
+            <w:r>
+              <w:rPr>
+                <w:rFonts w:ascii="Calibri" w:hAnsi="Calibri" w:eastAsia="Calibri"/>
+                <w:b w:val="0"/>
+                <w:color w:val="1A1A1A"/>
+                <w:sz w:val="16"/>
+              </w:rPr>
+            </w:r>
+          </w:p>
+        </w:tc>
+        <w:tc>
+          <w:tcPr>
+            <w:tcW w:type="dxa" w:w="1158"/>
+            <w:shd w:val="clear" w:color="auto" w:fill="FFFFFF"/>
+            <w:tcMar>
+              <w:top w:w="60" w:type="dxa"/>
+              <w:left w:w="60" w:type="dxa"/>
+              <w:bottom w:w="60" w:type="dxa"/>
+              <w:right w:w="60" w:type="dxa"/>
+            </w:tcMar>
+          </w:tcPr>
+          <w:p>
+            <w:pPr>
+              <w:spacing w:before="20" w:after="20"/>
+            </w:pPr>
+            <w:r/>
+            <w:r>
+              <w:rPr>
+                <w:rFonts w:ascii="Calibri" w:hAnsi="Calibri" w:eastAsia="Calibri"/>
+                <w:b w:val="0"/>
+                <w:color w:val="1A1A1A"/>
+                <w:sz w:val="16"/>
+              </w:rPr>
+              <w:t>0001000559</w:t>
+            </w:r>
+          </w:p>
+        </w:tc>
+        <w:tc>
+          <w:tcPr>
+            <w:tcW w:type="dxa" w:w="1158"/>
+            <w:shd w:val="clear" w:color="auto" w:fill="FFFFFF"/>
+            <w:tcMar>
+              <w:top w:w="60" w:type="dxa"/>
+              <w:left w:w="60" w:type="dxa"/>
+              <w:bottom w:w="60" w:type="dxa"/>
+              <w:right w:w="60" w:type="dxa"/>
+            </w:tcMar>
+          </w:tcPr>
+          <w:p>
+            <w:pPr>
+              <w:spacing w:before="20" w:after="20"/>
+            </w:pPr>
+            <w:r/>
+            <w:r>
+              <w:rPr>
+                <w:rFonts w:ascii="Calibri" w:hAnsi="Calibri" w:eastAsia="Calibri"/>
+                <w:b w:val="0"/>
+                <w:color w:val="1A1A1A"/>
+                <w:sz w:val="16"/>
+              </w:rPr>
+            </w:r>
+          </w:p>
+        </w:tc>
+        <w:tc>
+          <w:tcPr>
+            <w:tcW w:type="dxa" w:w="1158"/>
+            <w:shd w:val="clear" w:color="auto" w:fill="FFFFFF"/>
+            <w:tcMar>
+              <w:top w:w="60" w:type="dxa"/>
+              <w:left w:w="60" w:type="dxa"/>
+              <w:bottom w:w="60" w:type="dxa"/>
+              <w:right w:w="60" w:type="dxa"/>
+            </w:tcMar>
+          </w:tcPr>
+          <w:p>
+            <w:pPr>
+              <w:spacing w:before="20" w:after="20"/>
+            </w:pPr>
+            <w:r/>
+            <w:r>
+              <w:rPr>
+                <w:rFonts w:ascii="Calibri" w:hAnsi="Calibri" w:eastAsia="Calibri"/>
+                <w:b w:val="0"/>
+                <w:color w:val="1A1A1A"/>
+                <w:sz w:val="16"/>
+              </w:rPr>
+            </w:r>
+          </w:p>
+        </w:tc>
+      </w:tr>
+      <w:tr>
+        <w:trPr>
+          <w:cantSplit/>
+        </w:trPr>
+        <w:tc>
+          <w:tcPr>
+            <w:tcW w:type="dxa" w:w="1158"/>
+            <w:shd w:val="clear" w:color="auto" w:fill="F3F6F9"/>
+            <w:tcMar>
+              <w:top w:w="60" w:type="dxa"/>
+              <w:left w:w="60" w:type="dxa"/>
+              <w:bottom w:w="60" w:type="dxa"/>
+              <w:right w:w="60" w:type="dxa"/>
+            </w:tcMar>
+          </w:tcPr>
+          <w:p>
+            <w:pPr>
+              <w:spacing w:before="20" w:after="20"/>
+            </w:pPr>
+            <w:r/>
+            <w:r>
+              <w:rPr>
+                <w:rFonts w:ascii="Calibri" w:hAnsi="Calibri" w:eastAsia="Calibri"/>
+                <w:b w:val="0"/>
+                <w:color w:val="1A1A1A"/>
+                <w:sz w:val="16"/>
+              </w:rPr>
+              <w:t>1500000000</w:t>
+            </w:r>
+          </w:p>
+        </w:tc>
+        <w:tc>
+          <w:tcPr>
+            <w:tcW w:type="dxa" w:w="1158"/>
+            <w:shd w:val="clear" w:color="auto" w:fill="F3F6F9"/>
+            <w:tcMar>
+              <w:top w:w="60" w:type="dxa"/>
+              <w:left w:w="60" w:type="dxa"/>
+              <w:bottom w:w="60" w:type="dxa"/>
+              <w:right w:w="60" w:type="dxa"/>
+            </w:tcMar>
+          </w:tcPr>
+          <w:p>
+            <w:pPr>
+              <w:spacing w:before="20" w:after="20"/>
+            </w:pPr>
+            <w:r/>
+            <w:r>
+              <w:rPr>
+                <w:rFonts w:ascii="Calibri" w:hAnsi="Calibri" w:eastAsia="Calibri"/>
+                <w:b w:val="0"/>
+                <w:color w:val="1A1A1A"/>
+                <w:sz w:val="16"/>
+              </w:rPr>
+              <w:t>000002</w:t>
+            </w:r>
+          </w:p>
+        </w:tc>
+        <w:tc>
+          <w:tcPr>
+            <w:tcW w:type="dxa" w:w="1158"/>
+            <w:shd w:val="clear" w:color="auto" w:fill="F3F6F9"/>
+            <w:tcMar>
+              <w:top w:w="60" w:type="dxa"/>
+              <w:left w:w="60" w:type="dxa"/>
+              <w:bottom w:w="60" w:type="dxa"/>
+              <w:right w:w="60" w:type="dxa"/>
+            </w:tcMar>
+          </w:tcPr>
+          <w:p>
+            <w:pPr>
+              <w:spacing w:before="20" w:after="20"/>
+            </w:pPr>
+            <w:r/>
+            <w:r>
+              <w:rPr>
+                <w:rFonts w:ascii="Calibri" w:hAnsi="Calibri" w:eastAsia="Calibri"/>
+                <w:b w:val="0"/>
+                <w:color w:val="1A1A1A"/>
+                <w:sz w:val="16"/>
+              </w:rPr>
+              <w:t>0021100000</w:t>
+            </w:r>
+          </w:p>
+        </w:tc>
+        <w:tc>
+          <w:tcPr>
+            <w:tcW w:type="dxa" w:w="1158"/>
+            <w:shd w:val="clear" w:color="auto" w:fill="F3F6F9"/>
+            <w:tcMar>
+              <w:top w:w="60" w:type="dxa"/>
+              <w:left w:w="60" w:type="dxa"/>
+              <w:bottom w:w="60" w:type="dxa"/>
+              <w:right w:w="60" w:type="dxa"/>
+            </w:tcMar>
+          </w:tcPr>
+          <w:p>
+            <w:pPr>
+              <w:spacing w:before="20" w:after="20"/>
+            </w:pPr>
+            <w:r/>
+            <w:r>
+              <w:rPr>
+                <w:rFonts w:ascii="Calibri" w:hAnsi="Calibri" w:eastAsia="Calibri"/>
+                <w:b w:val="0"/>
+                <w:color w:val="1A1A1A"/>
+                <w:sz w:val="16"/>
+              </w:rPr>
+              <w:t>S</w:t>
+            </w:r>
+          </w:p>
+        </w:tc>
+        <w:tc>
+          <w:tcPr>
+            <w:tcW w:type="dxa" w:w="1158"/>
+            <w:shd w:val="clear" w:color="auto" w:fill="F3F6F9"/>
+            <w:tcMar>
+              <w:top w:w="60" w:type="dxa"/>
+              <w:left w:w="60" w:type="dxa"/>
+              <w:bottom w:w="60" w:type="dxa"/>
+              <w:right w:w="60" w:type="dxa"/>
+            </w:tcMar>
+          </w:tcPr>
+          <w:p>
+            <w:pPr>
+              <w:spacing w:before="20" w:after="20"/>
+            </w:pPr>
+            <w:r/>
+            <w:r>
+              <w:rPr>
+                <w:rFonts w:ascii="Calibri" w:hAnsi="Calibri" w:eastAsia="Calibri"/>
+                <w:b w:val="0"/>
+                <w:color w:val="1A1A1A"/>
+                <w:sz w:val="16"/>
+              </w:rPr>
+              <w:t>160.50</w:t>
+            </w:r>
+          </w:p>
+        </w:tc>
+        <w:tc>
+          <w:tcPr>
+            <w:tcW w:type="dxa" w:w="1158"/>
+            <w:shd w:val="clear" w:color="auto" w:fill="F3F6F9"/>
+            <w:tcMar>
+              <w:top w:w="60" w:type="dxa"/>
+              <w:left w:w="60" w:type="dxa"/>
+              <w:bottom w:w="60" w:type="dxa"/>
+              <w:right w:w="60" w:type="dxa"/>
+            </w:tcMar>
+          </w:tcPr>
+          <w:p>
+            <w:pPr>
+              <w:spacing w:before="20" w:after="20"/>
+            </w:pPr>
+            <w:r/>
+            <w:r>
+              <w:rPr>
+                <w:rFonts w:ascii="Calibri" w:hAnsi="Calibri" w:eastAsia="Calibri"/>
+                <w:b w:val="0"/>
+                <w:color w:val="1A1A1A"/>
+                <w:sz w:val="16"/>
+              </w:rPr>
+              <w:t>0001000559</w:t>
+            </w:r>
+          </w:p>
+        </w:tc>
+        <w:tc>
+          <w:tcPr>
+            <w:tcW w:type="dxa" w:w="1158"/>
+            <w:shd w:val="clear" w:color="auto" w:fill="F3F6F9"/>
+            <w:tcMar>
+              <w:top w:w="60" w:type="dxa"/>
+              <w:left w:w="60" w:type="dxa"/>
+              <w:bottom w:w="60" w:type="dxa"/>
+              <w:right w:w="60" w:type="dxa"/>
+            </w:tcMar>
+          </w:tcPr>
+          <w:p>
+            <w:pPr>
+              <w:spacing w:before="20" w:after="20"/>
+            </w:pPr>
+            <w:r/>
+            <w:r>
+              <w:rPr>
+                <w:rFonts w:ascii="Calibri" w:hAnsi="Calibri" w:eastAsia="Calibri"/>
+                <w:b w:val="0"/>
+                <w:color w:val="1A1A1A"/>
+                <w:sz w:val="16"/>
+              </w:rPr>
+              <w:t>0011002000</w:t>
+            </w:r>
+          </w:p>
+        </w:tc>
+        <w:tc>
+          <w:tcPr>
+            <w:tcW w:type="dxa" w:w="1158"/>
+            <w:shd w:val="clear" w:color="auto" w:fill="F3F6F9"/>
+            <w:tcMar>
+              <w:top w:w="60" w:type="dxa"/>
+              <w:left w:w="60" w:type="dxa"/>
+              <w:bottom w:w="60" w:type="dxa"/>
+              <w:right w:w="60" w:type="dxa"/>
+            </w:tcMar>
+          </w:tcPr>
+          <w:p>
+            <w:pPr>
+              <w:spacing w:before="20" w:after="20"/>
+            </w:pPr>
+            <w:r/>
+            <w:r>
+              <w:rPr>
+                <w:rFonts w:ascii="Calibri" w:hAnsi="Calibri" w:eastAsia="Calibri"/>
+                <w:b w:val="0"/>
+                <w:color w:val="1A1A1A"/>
+                <w:sz w:val="16"/>
+              </w:rPr>
+              <w:t>1500000000</w:t>
+            </w:r>
+          </w:p>
+        </w:tc>
+        <w:tc>
+          <w:tcPr>
+            <w:tcW w:type="dxa" w:w="1158"/>
+            <w:shd w:val="clear" w:color="auto" w:fill="F3F6F9"/>
+            <w:tcMar>
+              <w:top w:w="60" w:type="dxa"/>
+              <w:left w:w="60" w:type="dxa"/>
+              <w:bottom w:w="60" w:type="dxa"/>
+              <w:right w:w="60" w:type="dxa"/>
+            </w:tcMar>
+          </w:tcPr>
+          <w:p>
+            <w:pPr>
+              <w:spacing w:before="20" w:after="20"/>
+            </w:pPr>
+            <w:r/>
+            <w:r>
+              <w:rPr>
+                <w:rFonts w:ascii="Calibri" w:hAnsi="Calibri" w:eastAsia="Calibri"/>
+                <w:b w:val="0"/>
+                <w:color w:val="1A1A1A"/>
+                <w:sz w:val="16"/>
+              </w:rPr>
+              <w:t>20261006</w:t>
+            </w:r>
+          </w:p>
+        </w:tc>
+      </w:tr>
+    </w:tbl>
+    <w:p>
+      <w:pPr>
+        <w:spacing w:after="120"/>
+      </w:pPr>
+    </w:p>
+    <w:p>
+      <w:pPr>
+        <w:spacing w:after="80" w:before="0" w:line="259" w:lineRule="auto"/>
+      </w:pPr>
+      <w:r>
+        <w:rPr>
+          <w:rFonts w:ascii="Calibri" w:hAnsi="Calibri" w:eastAsia="Calibri"/>
+          <w:b/>
+          <w:color w:val="1A1A1A"/>
+          <w:sz w:val="22"/>
+        </w:rPr>
+        <w:t>Invoice vendor lines cleared by this payment</w:t>
+      </w:r>
+    </w:p>
+    <w:tbl>
+      <w:tblPr>
+        <w:tblStyle w:val="TableGrid"/>
+        <w:tblW w:type="auto" w:w="0"/>
+        <w:jc w:val="center"/>
+        <w:tblLayout w:type="autofit"/>
+        <w:tblLook w:firstColumn="1" w:firstRow="1" w:lastColumn="0" w:lastRow="0" w:noHBand="0" w:noVBand="1" w:val="04A0"/>
+      </w:tblPr>
+      <w:tblGrid>
+        <w:gridCol w:w="1738"/>
+        <w:gridCol w:w="1738"/>
+        <w:gridCol w:w="1738"/>
+        <w:gridCol w:w="1738"/>
+        <w:gridCol w:w="1738"/>
+        <w:gridCol w:w="1738"/>
+      </w:tblGrid>
+      <w:tr>
+        <w:trPr>
+          <w:tblHeader/>
+          <w:cantSplit/>
+        </w:trPr>
+        <w:tc>
+          <w:tcPr>
+            <w:tcW w:type="dxa" w:w="1738"/>
+            <w:shd w:val="clear" w:color="auto" w:fill="1F4E79"/>
+            <w:tcMar>
+              <w:top w:w="60" w:type="dxa"/>
+              <w:left w:w="60" w:type="dxa"/>
+              <w:bottom w:w="60" w:type="dxa"/>
+              <w:right w:w="60" w:type="dxa"/>
+            </w:tcMar>
+          </w:tcPr>
+          <w:p>
+            <w:pPr>
+              <w:spacing w:before="20" w:after="20"/>
+            </w:pPr>
+            <w:r/>
+            <w:r>
+              <w:rPr>
+                <w:rFonts w:ascii="Calibri" w:hAnsi="Calibri" w:eastAsia="Calibri"/>
+                <w:b/>
+                <w:color w:val="FFFFFF"/>
+                <w:sz w:val="16"/>
+              </w:rPr>
+              <w:t>FI document</w:t>
+            </w:r>
+          </w:p>
+        </w:tc>
+        <w:tc>
+          <w:tcPr>
+            <w:tcW w:type="dxa" w:w="1738"/>
+            <w:shd w:val="clear" w:color="auto" w:fill="1F4E79"/>
+            <w:tcMar>
+              <w:top w:w="60" w:type="dxa"/>
+              <w:left w:w="60" w:type="dxa"/>
+              <w:bottom w:w="60" w:type="dxa"/>
+              <w:right w:w="60" w:type="dxa"/>
+            </w:tcMar>
+          </w:tcPr>
+          <w:p>
+            <w:pPr>
+              <w:spacing w:before="20" w:after="20"/>
+            </w:pPr>
+            <w:r/>
+            <w:r>
+              <w:rPr>
+                <w:rFonts w:ascii="Calibri" w:hAnsi="Calibri" w:eastAsia="Calibri"/>
+                <w:b/>
+                <w:color w:val="FFFFFF"/>
+                <w:sz w:val="16"/>
+              </w:rPr>
+              <w:t>Supplier invoice</w:t>
+            </w:r>
+          </w:p>
+        </w:tc>
+        <w:tc>
+          <w:tcPr>
+            <w:tcW w:type="dxa" w:w="1738"/>
+            <w:shd w:val="clear" w:color="auto" w:fill="1F4E79"/>
+            <w:tcMar>
+              <w:top w:w="60" w:type="dxa"/>
+              <w:left w:w="60" w:type="dxa"/>
+              <w:bottom w:w="60" w:type="dxa"/>
+              <w:right w:w="60" w:type="dxa"/>
+            </w:tcMar>
+          </w:tcPr>
+          <w:p>
+            <w:pPr>
+              <w:spacing w:before="20" w:after="20"/>
+            </w:pPr>
+            <w:r/>
+            <w:r>
+              <w:rPr>
+                <w:rFonts w:ascii="Calibri" w:hAnsi="Calibri" w:eastAsia="Calibri"/>
+                <w:b/>
+                <w:color w:val="FFFFFF"/>
+                <w:sz w:val="16"/>
+              </w:rPr>
+              <w:t>Amount USD</w:t>
+            </w:r>
+          </w:p>
+        </w:tc>
+        <w:tc>
+          <w:tcPr>
+            <w:tcW w:type="dxa" w:w="1738"/>
+            <w:shd w:val="clear" w:color="auto" w:fill="1F4E79"/>
+            <w:tcMar>
+              <w:top w:w="60" w:type="dxa"/>
+              <w:left w:w="60" w:type="dxa"/>
+              <w:bottom w:w="60" w:type="dxa"/>
+              <w:right w:w="60" w:type="dxa"/>
+            </w:tcMar>
+          </w:tcPr>
+          <w:p>
+            <w:pPr>
+              <w:spacing w:before="20" w:after="20"/>
+            </w:pPr>
+            <w:r/>
+            <w:r>
+              <w:rPr>
+                <w:rFonts w:ascii="Calibri" w:hAnsi="Calibri" w:eastAsia="Calibri"/>
+                <w:b/>
+                <w:color w:val="FFFFFF"/>
+                <w:sz w:val="16"/>
+              </w:rPr>
+              <w:t>Item text</w:t>
+            </w:r>
+          </w:p>
+        </w:tc>
+        <w:tc>
+          <w:tcPr>
+            <w:tcW w:type="dxa" w:w="1738"/>
+            <w:shd w:val="clear" w:color="auto" w:fill="1F4E79"/>
+            <w:tcMar>
+              <w:top w:w="60" w:type="dxa"/>
+              <w:left w:w="60" w:type="dxa"/>
+              <w:bottom w:w="60" w:type="dxa"/>
+              <w:right w:w="60" w:type="dxa"/>
+            </w:tcMar>
+          </w:tcPr>
+          <w:p>
+            <w:pPr>
+              <w:spacing w:before="20" w:after="20"/>
+            </w:pPr>
+            <w:r/>
+            <w:r>
+              <w:rPr>
+                <w:rFonts w:ascii="Calibri" w:hAnsi="Calibri" w:eastAsia="Calibri"/>
+                <w:b/>
+                <w:color w:val="FFFFFF"/>
+                <w:sz w:val="16"/>
+              </w:rPr>
+              <w:t>Clearing doc</w:t>
+            </w:r>
+          </w:p>
+        </w:tc>
+        <w:tc>
+          <w:tcPr>
+            <w:tcW w:type="dxa" w:w="1738"/>
+            <w:shd w:val="clear" w:color="auto" w:fill="1F4E79"/>
+            <w:tcMar>
+              <w:top w:w="60" w:type="dxa"/>
+              <w:left w:w="60" w:type="dxa"/>
+              <w:bottom w:w="60" w:type="dxa"/>
+              <w:right w:w="60" w:type="dxa"/>
+            </w:tcMar>
+          </w:tcPr>
+          <w:p>
+            <w:pPr>
+              <w:spacing w:before="20" w:after="20"/>
+            </w:pPr>
+            <w:r/>
+            <w:r>
+              <w:rPr>
+                <w:rFonts w:ascii="Calibri" w:hAnsi="Calibri" w:eastAsia="Calibri"/>
+                <w:b/>
+                <w:color w:val="FFFFFF"/>
+                <w:sz w:val="16"/>
+              </w:rPr>
+              <w:t>Clearing date</w:t>
+            </w:r>
+          </w:p>
+        </w:tc>
+      </w:tr>
+      <w:tr>
+        <w:trPr>
+          <w:cantSplit/>
+        </w:trPr>
+        <w:tc>
+          <w:tcPr>
+            <w:tcW w:type="dxa" w:w="1738"/>
+            <w:shd w:val="clear" w:color="auto" w:fill="FFFFFF"/>
+            <w:tcMar>
+              <w:top w:w="60" w:type="dxa"/>
+              <w:left w:w="60" w:type="dxa"/>
+              <w:bottom w:w="60" w:type="dxa"/>
+              <w:right w:w="60" w:type="dxa"/>
+            </w:tcMar>
+          </w:tcPr>
+          <w:p>
+            <w:pPr>
+              <w:spacing w:before="20" w:after="20"/>
+            </w:pPr>
+            <w:r/>
+            <w:r>
+              <w:rPr>
+                <w:rFonts w:ascii="Calibri" w:hAnsi="Calibri" w:eastAsia="Calibri"/>
+                <w:b w:val="0"/>
+                <w:color w:val="1A1A1A"/>
+                <w:sz w:val="16"/>
+              </w:rPr>
+              <w:t>5100000000</w:t>
+            </w:r>
+          </w:p>
+        </w:tc>
+        <w:tc>
+          <w:tcPr>
+            <w:tcW w:type="dxa" w:w="1738"/>
+            <w:shd w:val="clear" w:color="auto" w:fill="FFFFFF"/>
+            <w:tcMar>
+              <w:top w:w="60" w:type="dxa"/>
+              <w:left w:w="60" w:type="dxa"/>
+              <w:bottom w:w="60" w:type="dxa"/>
+              <w:right w:w="60" w:type="dxa"/>
+            </w:tcMar>
+          </w:tcPr>
+          <w:p>
+            <w:pPr>
+              <w:spacing w:before="20" w:after="20"/>
+            </w:pPr>
+            <w:r/>
+            <w:r>
+              <w:rPr>
+                <w:rFonts w:ascii="Calibri" w:hAnsi="Calibri" w:eastAsia="Calibri"/>
+                <w:b w:val="0"/>
+                <w:color w:val="1A1A1A"/>
+                <w:sz w:val="16"/>
+              </w:rPr>
+              <w:t>5100001598</w:t>
+            </w:r>
+          </w:p>
+        </w:tc>
+        <w:tc>
+          <w:tcPr>
+            <w:tcW w:type="dxa" w:w="1738"/>
+            <w:shd w:val="clear" w:color="auto" w:fill="FFFFFF"/>
+            <w:tcMar>
+              <w:top w:w="60" w:type="dxa"/>
+              <w:left w:w="60" w:type="dxa"/>
+              <w:bottom w:w="60" w:type="dxa"/>
+              <w:right w:w="60" w:type="dxa"/>
+            </w:tcMar>
+          </w:tcPr>
+          <w:p>
+            <w:pPr>
+              <w:spacing w:before="20" w:after="20"/>
+            </w:pPr>
+            <w:r/>
+            <w:r>
+              <w:rPr>
+                <w:rFonts w:ascii="Calibri" w:hAnsi="Calibri" w:eastAsia="Calibri"/>
+                <w:b w:val="0"/>
+                <w:color w:val="1A1A1A"/>
+                <w:sz w:val="16"/>
+              </w:rPr>
+              <w:t>-120.00</w:t>
+            </w:r>
+          </w:p>
+        </w:tc>
+        <w:tc>
+          <w:tcPr>
+            <w:tcW w:type="dxa" w:w="1738"/>
+            <w:shd w:val="clear" w:color="auto" w:fill="FFFFFF"/>
+            <w:tcMar>
+              <w:top w:w="60" w:type="dxa"/>
+              <w:left w:w="60" w:type="dxa"/>
+              <w:bottom w:w="60" w:type="dxa"/>
+              <w:right w:w="60" w:type="dxa"/>
+            </w:tcMar>
+          </w:tcPr>
+          <w:p>
+            <w:pPr>
+              <w:spacing w:before="20" w:after="20"/>
+            </w:pPr>
+            <w:r/>
+            <w:r>
+              <w:rPr>
+                <w:rFonts w:ascii="Calibri" w:hAnsi="Calibri" w:eastAsia="Calibri"/>
+                <w:b w:val="0"/>
+                <w:color w:val="1A1A1A"/>
+                <w:sz w:val="16"/>
+              </w:rPr>
+              <w:t>INVOICE SUPP.INV.0001</w:t>
+            </w:r>
+          </w:p>
+        </w:tc>
+        <w:tc>
+          <w:tcPr>
+            <w:tcW w:type="dxa" w:w="1738"/>
+            <w:shd w:val="clear" w:color="auto" w:fill="FFFFFF"/>
+            <w:tcMar>
+              <w:top w:w="60" w:type="dxa"/>
+              <w:left w:w="60" w:type="dxa"/>
+              <w:bottom w:w="60" w:type="dxa"/>
+              <w:right w:w="60" w:type="dxa"/>
+            </w:tcMar>
+          </w:tcPr>
+          <w:p>
+            <w:pPr>
+              <w:spacing w:before="20" w:after="20"/>
+            </w:pPr>
+            <w:r/>
+            <w:r>
+              <w:rPr>
+                <w:rFonts w:ascii="Calibri" w:hAnsi="Calibri" w:eastAsia="Calibri"/>
+                <w:b w:val="0"/>
+                <w:color w:val="1A1A1A"/>
+                <w:sz w:val="16"/>
+              </w:rPr>
+              <w:t>1500000000</w:t>
+            </w:r>
+          </w:p>
+        </w:tc>
+        <w:tc>
+          <w:tcPr>
+            <w:tcW w:type="dxa" w:w="1738"/>
+            <w:shd w:val="clear" w:color="auto" w:fill="FFFFFF"/>
+            <w:tcMar>
+              <w:top w:w="60" w:type="dxa"/>
+              <w:left w:w="60" w:type="dxa"/>
+              <w:bottom w:w="60" w:type="dxa"/>
+              <w:right w:w="60" w:type="dxa"/>
+            </w:tcMar>
+          </w:tcPr>
+          <w:p>
+            <w:pPr>
+              <w:spacing w:before="20" w:after="20"/>
+            </w:pPr>
+            <w:r/>
+            <w:r>
+              <w:rPr>
+                <w:rFonts w:ascii="Calibri" w:hAnsi="Calibri" w:eastAsia="Calibri"/>
+                <w:b w:val="0"/>
+                <w:color w:val="1A1A1A"/>
+                <w:sz w:val="16"/>
+              </w:rPr>
+              <w:t>20261006</w:t>
+            </w:r>
+          </w:p>
+        </w:tc>
+      </w:tr>
+      <w:tr>
+        <w:trPr>
+          <w:cantSplit/>
+        </w:trPr>
+        <w:tc>
+          <w:tcPr>
+            <w:tcW w:type="dxa" w:w="1738"/>
+            <w:shd w:val="clear" w:color="auto" w:fill="F3F6F9"/>
+            <w:tcMar>
+              <w:top w:w="60" w:type="dxa"/>
+              <w:left w:w="60" w:type="dxa"/>
+              <w:bottom w:w="60" w:type="dxa"/>
+              <w:right w:w="60" w:type="dxa"/>
+            </w:tcMar>
+          </w:tcPr>
+          <w:p>
+            <w:pPr>
+              <w:spacing w:before="20" w:after="20"/>
+            </w:pPr>
+            <w:r/>
+            <w:r>
+              <w:rPr>
+                <w:rFonts w:ascii="Calibri" w:hAnsi="Calibri" w:eastAsia="Calibri"/>
+                <w:b w:val="0"/>
+                <w:color w:val="1A1A1A"/>
+                <w:sz w:val="16"/>
+              </w:rPr>
+              <w:t>5100000001</w:t>
+            </w:r>
+          </w:p>
+        </w:tc>
+        <w:tc>
+          <w:tcPr>
+            <w:tcW w:type="dxa" w:w="1738"/>
+            <w:shd w:val="clear" w:color="auto" w:fill="F3F6F9"/>
+            <w:tcMar>
+              <w:top w:w="60" w:type="dxa"/>
+              <w:left w:w="60" w:type="dxa"/>
+              <w:bottom w:w="60" w:type="dxa"/>
+              <w:right w:w="60" w:type="dxa"/>
+            </w:tcMar>
+          </w:tcPr>
+          <w:p>
+            <w:pPr>
+              <w:spacing w:before="20" w:after="20"/>
+            </w:pPr>
+            <w:r/>
+            <w:r>
+              <w:rPr>
+                <w:rFonts w:ascii="Calibri" w:hAnsi="Calibri" w:eastAsia="Calibri"/>
+                <w:b w:val="0"/>
+                <w:color w:val="1A1A1A"/>
+                <w:sz w:val="16"/>
+              </w:rPr>
+              <w:t>5100001599</w:t>
+            </w:r>
+          </w:p>
+        </w:tc>
+        <w:tc>
+          <w:tcPr>
+            <w:tcW w:type="dxa" w:w="1738"/>
+            <w:shd w:val="clear" w:color="auto" w:fill="F3F6F9"/>
+            <w:tcMar>
+              <w:top w:w="60" w:type="dxa"/>
+              <w:left w:w="60" w:type="dxa"/>
+              <w:bottom w:w="60" w:type="dxa"/>
+              <w:right w:w="60" w:type="dxa"/>
+            </w:tcMar>
+          </w:tcPr>
+          <w:p>
+            <w:pPr>
+              <w:spacing w:before="20" w:after="20"/>
+            </w:pPr>
+            <w:r/>
+            <w:r>
+              <w:rPr>
+                <w:rFonts w:ascii="Calibri" w:hAnsi="Calibri" w:eastAsia="Calibri"/>
+                <w:b w:val="0"/>
+                <w:color w:val="1A1A1A"/>
+                <w:sz w:val="16"/>
+              </w:rPr>
+              <w:t>-40.50</w:t>
+            </w:r>
+          </w:p>
+        </w:tc>
+        <w:tc>
+          <w:tcPr>
+            <w:tcW w:type="dxa" w:w="1738"/>
+            <w:shd w:val="clear" w:color="auto" w:fill="F3F6F9"/>
+            <w:tcMar>
+              <w:top w:w="60" w:type="dxa"/>
+              <w:left w:w="60" w:type="dxa"/>
+              <w:bottom w:w="60" w:type="dxa"/>
+              <w:right w:w="60" w:type="dxa"/>
+            </w:tcMar>
+          </w:tcPr>
+          <w:p>
+            <w:pPr>
+              <w:spacing w:before="20" w:after="20"/>
+            </w:pPr>
+            <w:r/>
+            <w:r>
+              <w:rPr>
+                <w:rFonts w:ascii="Calibri" w:hAnsi="Calibri" w:eastAsia="Calibri"/>
+                <w:b w:val="0"/>
+                <w:color w:val="1A1A1A"/>
+                <w:sz w:val="16"/>
+              </w:rPr>
+              <w:t>SUPP.INV.0002</w:t>
+            </w:r>
+          </w:p>
+        </w:tc>
+        <w:tc>
+          <w:tcPr>
+            <w:tcW w:type="dxa" w:w="1738"/>
+            <w:shd w:val="clear" w:color="auto" w:fill="F3F6F9"/>
+            <w:tcMar>
+              <w:top w:w="60" w:type="dxa"/>
+              <w:left w:w="60" w:type="dxa"/>
+              <w:bottom w:w="60" w:type="dxa"/>
+              <w:right w:w="60" w:type="dxa"/>
+            </w:tcMar>
+          </w:tcPr>
+          <w:p>
+            <w:pPr>
+              <w:spacing w:before="20" w:after="20"/>
+            </w:pPr>
+            <w:r/>
+            <w:r>
+              <w:rPr>
+                <w:rFonts w:ascii="Calibri" w:hAnsi="Calibri" w:eastAsia="Calibri"/>
+                <w:b w:val="0"/>
+                <w:color w:val="1A1A1A"/>
+                <w:sz w:val="16"/>
+              </w:rPr>
+              <w:t>1500000000</w:t>
+            </w:r>
+          </w:p>
+        </w:tc>
+        <w:tc>
+          <w:tcPr>
+            <w:tcW w:type="dxa" w:w="1738"/>
+            <w:shd w:val="clear" w:color="auto" w:fill="F3F6F9"/>
+            <w:tcMar>
+              <w:top w:w="60" w:type="dxa"/>
+              <w:left w:w="60" w:type="dxa"/>
+              <w:bottom w:w="60" w:type="dxa"/>
+              <w:right w:w="60" w:type="dxa"/>
+            </w:tcMar>
+          </w:tcPr>
+          <w:p>
+            <w:pPr>
+              <w:spacing w:before="20" w:after="20"/>
+            </w:pPr>
+            <w:r/>
+            <w:r>
+              <w:rPr>
+                <w:rFonts w:ascii="Calibri" w:hAnsi="Calibri" w:eastAsia="Calibri"/>
+                <w:b w:val="0"/>
+                <w:color w:val="1A1A1A"/>
+                <w:sz w:val="16"/>
+              </w:rPr>
+              <w:t>20261006</w:t>
+            </w:r>
+          </w:p>
+        </w:tc>
+      </w:tr>
+    </w:tbl>
+    <w:p>
+      <w:pPr>
+        <w:spacing w:after="120"/>
+      </w:pPr>
     </w:p>
     <w:p>
       <w:pPr>
@@ -18114,7 +20162,7 @@
           <w:color w:val="1A1A1A"/>
           <w:sz w:val="22"/>
         </w:rPr>
-        <w:t>Company 1710 in this extract has accounting document types RE, RV, WA, WE, and WL. A later payment would be a journal whose clearing fields point at accounting documents 5100000000 and 5100000001.</w:t>
+        <w:t>The credit of 160.50 is on G/L 0011002000 (external 11002000), posting key 50, assignment 20261006. The debit of 160.50 is on vendor account 0021100000, posting key 25, supplier 0001000559. Reference document type on the payment is BKPF. 120.00 plus 40.50 equals the payment amount, so one payment clears both invoices.</w:t>
       </w:r>
     </w:p>
     <w:p>
@@ -19425,6 +21473,92 @@
                 <w:sz w:val="16"/>
               </w:rPr>
               <w:t>GLAccount + CompanyCode</w:t>
+            </w:r>
+          </w:p>
+        </w:tc>
+      </w:tr>
+      <w:tr>
+        <w:trPr>
+          <w:cantSplit/>
+        </w:trPr>
+        <w:tc>
+          <w:tcPr>
+            <w:tcW w:type="dxa" w:w="3475"/>
+            <w:shd w:val="clear" w:color="auto" w:fill="FFFFFF"/>
+            <w:tcMar>
+              <w:top w:w="60" w:type="dxa"/>
+              <w:left w:w="60" w:type="dxa"/>
+              <w:bottom w:w="60" w:type="dxa"/>
+              <w:right w:w="60" w:type="dxa"/>
+            </w:tcMar>
+          </w:tcPr>
+          <w:p>
+            <w:pPr>
+              <w:spacing w:before="20" w:after="20"/>
+            </w:pPr>
+            <w:r/>
+            <w:r>
+              <w:rPr>
+                <w:rFonts w:ascii="Calibri" w:hAnsi="Calibri" w:eastAsia="Calibri"/>
+                <w:b w:val="0"/>
+                <w:color w:val="1A1A1A"/>
+                <w:sz w:val="16"/>
+              </w:rPr>
+              <w:t>Invoice vendor line</w:t>
+            </w:r>
+          </w:p>
+        </w:tc>
+        <w:tc>
+          <w:tcPr>
+            <w:tcW w:type="dxa" w:w="3475"/>
+            <w:shd w:val="clear" w:color="auto" w:fill="FFFFFF"/>
+            <w:tcMar>
+              <w:top w:w="60" w:type="dxa"/>
+              <w:left w:w="60" w:type="dxa"/>
+              <w:bottom w:w="60" w:type="dxa"/>
+              <w:right w:w="60" w:type="dxa"/>
+            </w:tcMar>
+          </w:tcPr>
+          <w:p>
+            <w:pPr>
+              <w:spacing w:before="20" w:after="20"/>
+            </w:pPr>
+            <w:r/>
+            <w:r>
+              <w:rPr>
+                <w:rFonts w:ascii="Calibri" w:hAnsi="Calibri" w:eastAsia="Calibri"/>
+                <w:b w:val="0"/>
+                <w:color w:val="1A1A1A"/>
+                <w:sz w:val="16"/>
+              </w:rPr>
+              <w:t>Payment 1500000000 type KZ</w:t>
+            </w:r>
+          </w:p>
+        </w:tc>
+        <w:tc>
+          <w:tcPr>
+            <w:tcW w:type="dxa" w:w="3475"/>
+            <w:shd w:val="clear" w:color="auto" w:fill="FFFFFF"/>
+            <w:tcMar>
+              <w:top w:w="60" w:type="dxa"/>
+              <w:left w:w="60" w:type="dxa"/>
+              <w:bottom w:w="60" w:type="dxa"/>
+              <w:right w:w="60" w:type="dxa"/>
+            </w:tcMar>
+          </w:tcPr>
+          <w:p>
+            <w:pPr>
+              <w:spacing w:before="20" w:after="20"/>
+            </w:pPr>
+            <w:r/>
+            <w:r>
+              <w:rPr>
+                <w:rFonts w:ascii="Calibri" w:hAnsi="Calibri" w:eastAsia="Calibri"/>
+                <w:b w:val="0"/>
+                <w:color w:val="1A1A1A"/>
+                <w:sz w:val="16"/>
+              </w:rPr>
+              <w:t>ClearingAccountingDocument + ClearingDate + Supplier</w:t>
             </w:r>
           </w:p>
         </w:tc>
@@ -20083,7 +22217,7 @@
                 <w:color w:val="1A1A1A"/>
                 <w:sz w:val="16"/>
               </w:rPr>
-              <w:t>CompanyCode eq '1710' and SourceLedger eq '0L' and the five accounting documents in section 9</w:t>
+              <w:t>CompanyCode eq '1710' and SourceLedger eq '0L' and accounting documents 5000000001, 5000000002, 5000000003, 5100000000, 5100000001, 1500000000</w:t>
             </w:r>
           </w:p>
         </w:tc>
@@ -20260,7 +22394,7 @@
                 <w:color w:val="1A1A1A"/>
                 <w:sz w:val="16"/>
               </w:rPr>
-              <w:t>CompanyCode eq '1710' and GLAccount eq '0013600000' or '0021100000' or '0021120000'</w:t>
+              <w:t>CompanyCode eq '1710' and GLAccount eq '0011002000' or '0013600000' or '0021100000' or '0021120000'</w:t>
             </w:r>
           </w:p>
         </w:tc>
@@ -20318,7 +22452,7 @@
         <w:color w:val="555555"/>
         <w:sz w:val="16"/>
       </w:rPr>
-      <w:t xml:space="preserve">Contract 4600000041  ·  PO 4500002146  ·  extract 20261006_094549  ·  </w:t>
+      <w:t xml:space="preserve">Contract 4600000041  ·  PO 4500002146  ·  payment 1500000000  ·  </w:t>
     </w:r>
     <w:r>
       <w:rPr>

</xml_diff>

<commit_message>
Use the same chapter sequence in the three use-case documents
Drop the selection chapter and walk each case from business partner through source document, follow-on document, goods movement, invoice, accounting, reconciliation, and clearing.

Co-authored-by: aleo25672 <aleo25672@users.noreply.github.com>
</commit_message>
<xml_diff>
--- a/docs/CONTRACT_TO_PAYMENT.docx
+++ b/docs/CONTRACT_TO_PAYMENT.docx
@@ -83,7 +83,7 @@
           <w:color w:val="1A1A1A"/>
           <w:sz w:val="22"/>
         </w:rPr>
-        <w:t>ZEVO writes one CDS entity per file and one entity per ExtractCds call. It does not join documents. The client correlates the files with the keys in section 12. Full extracts are in docs/samples/c2p/source. The rows used here are in docs/samples/c2p/seed. Dates in the tables are YYYYMMDD, as stored in the CSV.</w:t>
+        <w:t>ZEVO writes one CDS entity per file and one entity per ExtractCds call. It does not join documents. The client correlates the files with the keys in section 11. Full extracts are in docs/samples/c2p/source. The rows used here are in docs/samples/c2p/seed. Dates in the tables are YYYYMMDD, as stored in the CSV.</w:t>
       </w:r>
     </w:p>
     <w:p>
@@ -749,43 +749,7 @@
         <w:pStyle w:val="Heading1"/>
       </w:pPr>
       <w:r>
-        <w:t>3. Why these two documents</w:t>
-      </w:r>
-    </w:p>
-    <w:p>
-      <w:pPr>
-        <w:spacing w:after="160" w:before="0" w:line="259" w:lineRule="auto"/>
-      </w:pPr>
-      <w:r>
-        <w:rPr>
-          <w:rFonts w:ascii="Calibri" w:hAnsi="Calibri" w:eastAsia="Calibri"/>
-          <w:b w:val="0"/>
-          <w:color w:val="1A1A1A"/>
-          <w:sz w:val="22"/>
-        </w:rPr>
-        <w:t>4600000041 is the only purchase contract that is present in the bounded contract header and item extracts and that also has a release order in the purchase-order extract. PO 4500002146 is that release, and it continues through goods receipt, supplier invoice, the universal journal, and vendor payment 1500000000.</w:t>
-      </w:r>
-    </w:p>
-    <w:p>
-      <w:pPr>
-        <w:spacing w:after="160" w:before="0" w:line="259" w:lineRule="auto"/>
-      </w:pPr>
-      <w:r>
-        <w:rPr>
-          <w:rFonts w:ascii="Calibri" w:hAnsi="Calibri" w:eastAsia="Calibri"/>
-          <w:b w:val="0"/>
-          <w:color w:val="1A1A1A"/>
-          <w:sz w:val="22"/>
-        </w:rPr>
-        <w:t>Contracts 4600000031 and 4600000040 are in the same contract extract and have no release rows. Purchase orders 4500002142 through 4500002145 release contract 4600000038, which is not in the contract header or item files. Only 4500002143 has a goods receipt, and none of those orders has a supplier invoice in this extract.</w:t>
-      </w:r>
-    </w:p>
-    <w:p>
-      <w:pPr>
-        <w:pStyle w:val="Heading1"/>
-      </w:pPr>
-      <w:r>
-        <w:t>4. Supplier</w:t>
+        <w:t>3. Business partner</w:t>
       </w:r>
     </w:p>
     <w:p>
@@ -1876,7 +1840,7 @@
         <w:pStyle w:val="Heading1"/>
       </w:pPr>
       <w:r>
-        <w:t>5. Purchase contract 4600000041</w:t>
+        <w:t>4. Source document</w:t>
       </w:r>
     </w:p>
     <w:p>
@@ -4384,7 +4348,7 @@
         <w:pStyle w:val="Heading1"/>
       </w:pPr>
       <w:r>
-        <w:t>6. Release purchase order 4500002146</w:t>
+        <w:t>5. Follow-on document</w:t>
       </w:r>
     </w:p>
     <w:p>
@@ -6905,7 +6869,7 @@
         <w:pStyle w:val="Heading1"/>
       </w:pPr>
       <w:r>
-        <w:t>7. Goods receipts</w:t>
+        <w:t>6. Goods movement</w:t>
       </w:r>
     </w:p>
     <w:p>
@@ -9805,7 +9769,7 @@
         <w:pStyle w:val="Heading1"/>
       </w:pPr>
       <w:r>
-        <w:t>8. Supplier invoices</w:t>
+        <w:t>7. Invoice</w:t>
       </w:r>
     </w:p>
     <w:p>
@@ -12307,7 +12271,7 @@
         <w:pStyle w:val="Heading1"/>
       </w:pPr>
       <w:r>
-        <w:t>9. Universal journal</w:t>
+        <w:t>8. Accounting</w:t>
       </w:r>
     </w:p>
     <w:p>
@@ -17326,7 +17290,7 @@
         <w:pStyle w:val="Heading1"/>
       </w:pPr>
       <w:r>
-        <w:t>10. Quantity and amount reconciliation</w:t>
+        <w:t>9. Quantity and amount reconciliation</w:t>
       </w:r>
     </w:p>
     <w:p>
@@ -18801,7 +18765,7 @@
         <w:pStyle w:val="Heading1"/>
       </w:pPr>
       <w:r>
-        <w:t>11. Payment</w:t>
+        <w:t>10. Clearing</w:t>
       </w:r>
     </w:p>
     <w:p>
@@ -20170,7 +20134,7 @@
         <w:pStyle w:val="Heading1"/>
       </w:pPr>
       <w:r>
-        <w:t>12. How the documents are correlated</w:t>
+        <w:t>11. How the documents are correlated</w:t>
       </w:r>
     </w:p>
     <w:tbl>
@@ -21588,7 +21552,7 @@
         <w:pStyle w:val="Heading1"/>
       </w:pPr>
       <w:r>
-        <w:t>13. Extract calls for this reference</w:t>
+        <w:t>12. Extract calls for this reference</w:t>
       </w:r>
     </w:p>
     <w:p>
@@ -22410,7 +22374,7 @@
         <w:pStyle w:val="Heading1"/>
       </w:pPr>
       <w:r>
-        <w:t>14. Sample-data files</w:t>
+        <w:t>13. Sample-data files</w:t>
       </w:r>
     </w:p>
     <w:p>

</xml_diff>